<commit_message>
docs(artigo): regenerar artigo_md.docx com §3.4.3 QCL936-BEN e tabelas atualizadas
Co-Authored-By: Claude Sonnet 4.6 <noreply@anthropic.com>
</commit_message>
<xml_diff>
--- a/artigo_md.docx
+++ b/artigo_md.docx
@@ -2667,7 +2667,7 @@
                 <w:rFonts w:ascii="Times New Roman" w:hAnsi="Times New Roman"/>
                 <w:sz w:val="20"/>
               </w:rPr>
-              <w:t>—</w:t>
+              <w:t>200 ns</w:t>
             </w:r>
           </w:p>
         </w:tc>
@@ -2681,7 +2681,7 @@
                 <w:rFonts w:ascii="Times New Roman" w:hAnsi="Times New Roman"/>
                 <w:sz w:val="20"/>
               </w:rPr>
-              <w:t>—</w:t>
+              <w:t>0,116 ± 0,018</w:t>
             </w:r>
           </w:p>
         </w:tc>
@@ -2695,7 +2695,7 @@
                 <w:rFonts w:ascii="Times New Roman" w:hAnsi="Times New Roman"/>
                 <w:sz w:val="20"/>
               </w:rPr>
-              <w:t>—</w:t>
+              <w:t>N.D.ª</w:t>
             </w:r>
           </w:p>
         </w:tc>
@@ -2709,7 +2709,7 @@
                 <w:rFonts w:ascii="Times New Roman" w:hAnsi="Times New Roman"/>
                 <w:sz w:val="20"/>
               </w:rPr>
-              <w:t>—</w:t>
+              <w:t>90,1 ± 41,6</w:t>
             </w:r>
           </w:p>
         </w:tc>
@@ -2723,7 +2723,7 @@
                 <w:rFonts w:ascii="Times New Roman" w:hAnsi="Times New Roman"/>
                 <w:sz w:val="20"/>
               </w:rPr>
-              <w:t>—</w:t>
+              <w:t>N.D.ᵇ</w:t>
             </w:r>
           </w:p>
         </w:tc>
@@ -2737,7 +2737,7 @@
                 <w:rFonts w:ascii="Times New Roman" w:hAnsi="Times New Roman"/>
                 <w:sz w:val="20"/>
               </w:rPr>
-              <w:t>—</w:t>
+              <w:t>2,78 ± 0,136</w:t>
             </w:r>
           </w:p>
         </w:tc>
@@ -2751,7 +2751,7 @@
                 <w:rFonts w:ascii="Times New Roman" w:hAnsi="Times New Roman"/>
                 <w:sz w:val="20"/>
               </w:rPr>
-              <w:t>pendente</w:t>
+              <w:t>dissociação ~150 ns</w:t>
             </w:r>
           </w:p>
         </w:tc>
@@ -4060,6 +4060,92 @@
           </w:p>
         </w:tc>
       </w:tr>
+      <w:tr>
+        <w:tc>
+          <w:tcPr>
+            <w:tcW w:type="dxa" w:w="1520"/>
+          </w:tcPr>
+          <w:p>
+            <w:r>
+              <w:rPr>
+                <w:rFonts w:ascii="Times New Roman" w:hAnsi="Times New Roman"/>
+                <w:sz w:val="20"/>
+              </w:rPr>
+              <w:t>QCL936-BEN</w:t>
+            </w:r>
+          </w:p>
+        </w:tc>
+        <w:tc>
+          <w:tcPr>
+            <w:tcW w:type="dxa" w:w="1520"/>
+          </w:tcPr>
+          <w:p>
+            <w:r>
+              <w:rPr>
+                <w:rFonts w:ascii="Times New Roman" w:hAnsi="Times New Roman"/>
+                <w:sz w:val="20"/>
+              </w:rPr>
+              <w:t>His92 ~1,2ᵈ</w:t>
+            </w:r>
+          </w:p>
+        </w:tc>
+        <w:tc>
+          <w:tcPr>
+            <w:tcW w:type="dxa" w:w="1520"/>
+          </w:tcPr>
+          <w:p>
+            <w:r>
+              <w:rPr>
+                <w:rFonts w:ascii="Times New Roman" w:hAnsi="Times New Roman"/>
+                <w:sz w:val="20"/>
+              </w:rPr>
+              <w:t>Asp142 ~1,5ᵈ</w:t>
+            </w:r>
+          </w:p>
+        </w:tc>
+        <w:tc>
+          <w:tcPr>
+            <w:tcW w:type="dxa" w:w="1520"/>
+          </w:tcPr>
+          <w:p>
+            <w:r>
+              <w:rPr>
+                <w:rFonts w:ascii="Times New Roman" w:hAnsi="Times New Roman"/>
+                <w:sz w:val="20"/>
+              </w:rPr>
+              <w:t>Ser247 ~1,0ᵈ</w:t>
+            </w:r>
+          </w:p>
+        </w:tc>
+        <w:tc>
+          <w:tcPr>
+            <w:tcW w:type="dxa" w:w="1520"/>
+          </w:tcPr>
+          <w:p>
+            <w:r>
+              <w:rPr>
+                <w:rFonts w:ascii="Times New Roman" w:hAnsi="Times New Roman"/>
+                <w:sz w:val="20"/>
+              </w:rPr>
+              <w:t>Asp241 ~1,3ᵈ</w:t>
+            </w:r>
+          </w:p>
+        </w:tc>
+        <w:tc>
+          <w:tcPr>
+            <w:tcW w:type="dxa" w:w="1520"/>
+          </w:tcPr>
+          <w:p>
+            <w:r>
+              <w:rPr>
+                <w:rFonts w:ascii="Times New Roman" w:hAnsi="Times New Roman"/>
+                <w:sz w:val="20"/>
+              </w:rPr>
+              <w:t>Dissociação (~150 ns)ᵉ</w:t>
+            </w:r>
+          </w:p>
+        </w:tc>
+      </w:tr>
     </w:tbl>
     <w:p>
       <w:pPr/>
@@ -4073,6 +4159,25 @@
           <w:sz w:val="18"/>
         </w:rPr>
         <w:t>ᶜ Médias sobre 200 ns incluindo fase dissociada (95–200 ns); fase pré-dissociação (0–95 ns): Ile205 ~0,35 nm ⚠️, demais &gt;0,70 nm ❌.</w:t>
+      </w:r>
+    </w:p>
+    <w:p>
+      <w:pPr>
+        <w:spacing w:before="0"/>
+      </w:pPr>
+      <w:r>
+        <w:rPr>
+          <w:sz w:val="18"/>
+        </w:rPr>
+        <w:t>ᵈ Médias sobre 200 ns incluindo fase dissociada (150–200 ns); fase ligada (0–150 ns): His92 ~0,35 nm ✅, Ser247 ~0,30 nm ✅, Asp241 ~0,45 nm ⚠️, Asp142 ~0,85 nm ❌.</w:t>
+      </w:r>
+    </w:p>
+    <w:p>
+      <w:pPr>
+        <w:jc w:val="both"/>
+      </w:pPr>
+      <w:r>
+        <w:t>ᵉ Modo parcial na fase ligada (0–150 ns): His + Ser + S1 borderline (eco de QCL936-SKTI).</w:t>
       </w:r>
     </w:p>
     <w:p>
@@ -4853,6 +4958,453 @@
     </w:p>
     <w:p>
       <w:pPr>
+        <w:pStyle w:val="Heading3"/>
+      </w:pPr>
+      <w:r>
+        <w:t>3.4.3 Dinâmica molecular de benzamidina — QCL936-BEN (200 ns)</w:t>
+      </w:r>
+    </w:p>
+    <w:p>
+      <w:pPr>
+        <w:jc w:val="both"/>
+      </w:pPr>
+      <w:r>
+        <w:t>O complexo QCL936-BEN foi simulado por 200 ns com a mesma configuração dos demais sistemas da série BEN. Este receptor recebeu o melhor escore de docking Vina dentre os quatro receptores (−5,733 kcal/mol, 1°), atribuído à presença de Asp241 no bolsão S1 — o parceiro canônico da ponte salina amidínio↔Asp em tripsinas clássicas. A pose inicial correspondeu ao modo 1 do docking Vina.</w:t>
+      </w:r>
+    </w:p>
+    <w:p>
+      <w:pPr>
+        <w:pStyle w:val="Heading4"/>
+      </w:pPr>
+      <w:r>
+        <w:t>Estabilidade do receptor</w:t>
+      </w:r>
+    </w:p>
+    <w:p>
+      <w:pPr>
+        <w:jc w:val="both"/>
+      </w:pPr>
+      <w:r>
+        <w:t>O RMSD do backbone do QCL936 estabilizou em 0,116 ± 0,018 nm — o valor mais baixo de todos os sistemas avaliados neste trabalho, incluindo as séries GORE4 e SKTI —, indicando que o receptor QCL936 apresenta a maior rigidez estrutural intrínseca entre as isoformas estudadas, independente do ligante.</w:t>
+      </w:r>
+    </w:p>
+    <w:p>
+      <w:pPr>
+        <w:pStyle w:val="Heading4"/>
+      </w:pPr>
+      <w:r>
+        <w:t>Fase de ligação estável (0–150 ns)</w:t>
+      </w:r>
+    </w:p>
+    <w:p>
+      <w:pPr>
+        <w:jc w:val="both"/>
+      </w:pPr>
+      <w:r>
+        <w:t xml:space="preserve">Ao contrário do ACR157-BEN, no qual a fase de associação foi fraca (~80–100 contatos, Ile205 apenas borderline), o QCL936-BEN apresentou uma fase de ligação robusta nos primeiros 150 ns, com </w:t>
+      </w:r>
+      <w:r>
+        <w:rPr>
+          <w:b/>
+        </w:rPr>
+        <w:t>110–120 contatos estáveis</w:t>
+      </w:r>
+      <w:r>
+        <w:t xml:space="preserve"> e baixa variabilidade, indicando encaixe consistente no sítio de ligação. A análise das distâncias mínimas aos resíduos catalíticos durante esta fase revelou um padrão de ancoragem tri-residual:</w:t>
+      </w:r>
+    </w:p>
+    <w:p>
+      <w:pPr>
+        <w:pStyle w:val="ListBullet"/>
+        <w:spacing w:after="60"/>
+      </w:pPr>
+      <w:r>
+        <w:rPr>
+          <w:b/>
+        </w:rPr>
+        <w:t>His92</w:t>
+      </w:r>
+      <w:r>
+        <w:t xml:space="preserve"> (triad_1): ~0,35 nm ✅ — contato direto com a histidina catalítica</w:t>
+      </w:r>
+    </w:p>
+    <w:p>
+      <w:pPr>
+        <w:pStyle w:val="ListBullet"/>
+        <w:spacing w:after="60"/>
+      </w:pPr>
+      <w:r>
+        <w:t>Asp142 (triad_2): ~0,85 nm ❌ — distante durante toda a fase ligada</w:t>
+      </w:r>
+    </w:p>
+    <w:p>
+      <w:pPr>
+        <w:pStyle w:val="ListBullet"/>
+        <w:spacing w:after="60"/>
+      </w:pPr>
+      <w:r>
+        <w:rPr>
+          <w:b/>
+        </w:rPr>
+        <w:t>Ser247</w:t>
+      </w:r>
+      <w:r>
+        <w:t xml:space="preserve"> (triad_3): ~0,25–0,35 nm ✅ — contato direto com a serina nucleofílica</w:t>
+      </w:r>
+    </w:p>
+    <w:p>
+      <w:pPr>
+        <w:pStyle w:val="ListBullet"/>
+        <w:spacing w:after="60"/>
+      </w:pPr>
+      <w:r>
+        <w:rPr>
+          <w:b/>
+        </w:rPr>
+        <w:t>Asp241</w:t>
+      </w:r>
+      <w:r>
+        <w:t xml:space="preserve"> (S1, triad_4): ~0,40–0,50 nm ⚠️ — borderline, coerente com a ponte salina amidínio⁺↔Asp²⁻</w:t>
+      </w:r>
+    </w:p>
+    <w:p>
+      <w:pPr>
+        <w:jc w:val="both"/>
+      </w:pPr>
+      <w:r>
+        <w:t>Este padrão — His92 + Ser247 + Asp241/S1 bordeline, sem contato com Asp142 — replica estruturalmente o modo de inibição identificado para o QCL936-SKTI (His + Ser + S1, 3/4), sugerindo que a geometria do sítio ativo do QCL936 orienta os ligantes preferencialmente para esta trinca de resíduos, independente do tipo de ligante (proteína ou molécula pequena). O Asp241 no bolsão S1 atrai o amidínio (+1) por complementaridade eletrostática, enquanto o anel benzênico se posiciona na região entre His92 e Ser247.</w:t>
+      </w:r>
+    </w:p>
+    <w:p>
+      <w:pPr>
+        <w:pStyle w:val="Heading4"/>
+      </w:pPr>
+      <w:r>
+        <w:t>Evento de dissociação a ~150 ns</w:t>
+      </w:r>
+    </w:p>
+    <w:p>
+      <w:pPr>
+        <w:jc w:val="both"/>
+      </w:pPr>
+      <w:r>
+        <w:t>A partir de ~150 ns, ocorreu dissociação progressiva e irreversível: os contatos declinaram de ~110 para zero ao longo de 25 ns (150–175 ns), e todas as distâncias catalíticas saltaram simultaneamente para 4–7 nm. A partir de ~180 ns, BEN permaneceu completamente livre no solvente até o final da trajetória (200 ns). O valor médio de contatos integrado sobre os 200 ns foi de 90,1 ± 41,6 átomos, com SD/média = 46%, padrão diagnóstico de distribuição bimodal por dissociação.</w:t>
+      </w:r>
+    </w:p>
+    <w:p>
+      <w:pPr>
+        <w:pStyle w:val="Heading4"/>
+      </w:pPr>
+      <w:r>
+        <w:t>Comparação com ACR157-BEN e implicações mecanísticas</w:t>
+      </w:r>
+    </w:p>
+    <w:p>
+      <w:pPr>
+        <w:jc w:val="both"/>
+      </w:pPr>
+      <w:r>
+        <w:t>A comparação entre ACR157-BEN e QCL936-BEN revela o efeito direto da natureza do bolsão S1 sobre a estabilidade da benzamidina:</w:t>
+      </w:r>
+    </w:p>
+    <w:tbl>
+      <w:tblPr>
+        <w:tblStyle w:val="TableGrid"/>
+        <w:tblW w:type="auto" w:w="0"/>
+        <w:tblLook w:firstColumn="1" w:firstRow="1" w:lastColumn="0" w:lastRow="0" w:noHBand="0" w:noVBand="1" w:val="04A0"/>
+      </w:tblPr>
+      <w:tblGrid>
+        <w:gridCol w:w="3041"/>
+        <w:gridCol w:w="3041"/>
+        <w:gridCol w:w="3041"/>
+      </w:tblGrid>
+      <w:tr>
+        <w:tc>
+          <w:tcPr>
+            <w:tcW w:type="dxa" w:w="3041"/>
+            <w:shd w:val="clear" w:color="auto" w:fill="D9E1F2"/>
+          </w:tcPr>
+          <w:p>
+            <w:r>
+              <w:rPr>
+                <w:rFonts w:ascii="Times New Roman" w:hAnsi="Times New Roman"/>
+                <w:b/>
+                <w:sz w:val="20"/>
+              </w:rPr>
+              <w:t>Parâmetro</w:t>
+            </w:r>
+          </w:p>
+        </w:tc>
+        <w:tc>
+          <w:tcPr>
+            <w:tcW w:type="dxa" w:w="3041"/>
+            <w:shd w:val="clear" w:color="auto" w:fill="D9E1F2"/>
+          </w:tcPr>
+          <w:p>
+            <w:r>
+              <w:rPr>
+                <w:rFonts w:ascii="Times New Roman" w:hAnsi="Times New Roman"/>
+                <w:b/>
+                <w:sz w:val="20"/>
+              </w:rPr>
+              <w:t>ACR157-BEN</w:t>
+            </w:r>
+          </w:p>
+        </w:tc>
+        <w:tc>
+          <w:tcPr>
+            <w:tcW w:type="dxa" w:w="3041"/>
+            <w:shd w:val="clear" w:color="auto" w:fill="D9E1F2"/>
+          </w:tcPr>
+          <w:p>
+            <w:r>
+              <w:rPr>
+                <w:rFonts w:ascii="Times New Roman" w:hAnsi="Times New Roman"/>
+                <w:b/>
+                <w:sz w:val="20"/>
+              </w:rPr>
+              <w:t>QCL936-BEN</w:t>
+            </w:r>
+          </w:p>
+        </w:tc>
+      </w:tr>
+      <w:tr>
+        <w:tc>
+          <w:tcPr>
+            <w:tcW w:type="dxa" w:w="3041"/>
+          </w:tcPr>
+          <w:p>
+            <w:r>
+              <w:rPr>
+                <w:rFonts w:ascii="Times New Roman" w:hAnsi="Times New Roman"/>
+                <w:sz w:val="20"/>
+              </w:rPr>
+              <w:t>S1</w:t>
+            </w:r>
+          </w:p>
+        </w:tc>
+        <w:tc>
+          <w:tcPr>
+            <w:tcW w:type="dxa" w:w="3041"/>
+          </w:tcPr>
+          <w:p>
+            <w:r>
+              <w:rPr>
+                <w:rFonts w:ascii="Times New Roman" w:hAnsi="Times New Roman"/>
+                <w:sz w:val="20"/>
+              </w:rPr>
+              <w:t>Ile205 (neutro)</w:t>
+            </w:r>
+          </w:p>
+        </w:tc>
+        <w:tc>
+          <w:tcPr>
+            <w:tcW w:type="dxa" w:w="3041"/>
+          </w:tcPr>
+          <w:p>
+            <w:r>
+              <w:rPr>
+                <w:rFonts w:ascii="Times New Roman" w:hAnsi="Times New Roman"/>
+                <w:sz w:val="20"/>
+              </w:rPr>
+              <w:t>Asp241 (−)</w:t>
+            </w:r>
+          </w:p>
+        </w:tc>
+      </w:tr>
+      <w:tr>
+        <w:tc>
+          <w:tcPr>
+            <w:tcW w:type="dxa" w:w="3041"/>
+          </w:tcPr>
+          <w:p>
+            <w:r>
+              <w:rPr>
+                <w:rFonts w:ascii="Times New Roman" w:hAnsi="Times New Roman"/>
+                <w:sz w:val="20"/>
+              </w:rPr>
+              <w:t>Score Vina</w:t>
+            </w:r>
+          </w:p>
+        </w:tc>
+        <w:tc>
+          <w:tcPr>
+            <w:tcW w:type="dxa" w:w="3041"/>
+          </w:tcPr>
+          <w:p>
+            <w:r>
+              <w:rPr>
+                <w:rFonts w:ascii="Times New Roman" w:hAnsi="Times New Roman"/>
+                <w:sz w:val="20"/>
+              </w:rPr>
+              <w:t>−4,953 kcal/mol</w:t>
+            </w:r>
+          </w:p>
+        </w:tc>
+        <w:tc>
+          <w:tcPr>
+            <w:tcW w:type="dxa" w:w="3041"/>
+          </w:tcPr>
+          <w:p>
+            <w:r>
+              <w:rPr>
+                <w:rFonts w:ascii="Times New Roman" w:hAnsi="Times New Roman"/>
+                <w:sz w:val="20"/>
+              </w:rPr>
+              <w:t>−5,733 kcal/mol</w:t>
+            </w:r>
+          </w:p>
+        </w:tc>
+      </w:tr>
+      <w:tr>
+        <w:tc>
+          <w:tcPr>
+            <w:tcW w:type="dxa" w:w="3041"/>
+          </w:tcPr>
+          <w:p>
+            <w:r>
+              <w:rPr>
+                <w:rFonts w:ascii="Times New Roman" w:hAnsi="Times New Roman"/>
+                <w:sz w:val="20"/>
+              </w:rPr>
+              <w:t>Contatos (fase ligada)</w:t>
+            </w:r>
+          </w:p>
+        </w:tc>
+        <w:tc>
+          <w:tcPr>
+            <w:tcW w:type="dxa" w:w="3041"/>
+          </w:tcPr>
+          <w:p>
+            <w:r>
+              <w:rPr>
+                <w:rFonts w:ascii="Times New Roman" w:hAnsi="Times New Roman"/>
+                <w:sz w:val="20"/>
+              </w:rPr>
+              <w:t>~80–100 (fraco)</w:t>
+            </w:r>
+          </w:p>
+        </w:tc>
+        <w:tc>
+          <w:tcPr>
+            <w:tcW w:type="dxa" w:w="3041"/>
+          </w:tcPr>
+          <w:p>
+            <w:r>
+              <w:rPr>
+                <w:rFonts w:ascii="Times New Roman" w:hAnsi="Times New Roman"/>
+                <w:sz w:val="20"/>
+              </w:rPr>
+              <w:t>~110–120 (moderado)</w:t>
+            </w:r>
+          </w:p>
+        </w:tc>
+      </w:tr>
+      <w:tr>
+        <w:tc>
+          <w:tcPr>
+            <w:tcW w:type="dxa" w:w="3041"/>
+          </w:tcPr>
+          <w:p>
+            <w:r>
+              <w:rPr>
+                <w:rFonts w:ascii="Times New Roman" w:hAnsi="Times New Roman"/>
+                <w:sz w:val="20"/>
+              </w:rPr>
+              <w:t>Dissociação</w:t>
+            </w:r>
+          </w:p>
+        </w:tc>
+        <w:tc>
+          <w:tcPr>
+            <w:tcW w:type="dxa" w:w="3041"/>
+          </w:tcPr>
+          <w:p>
+            <w:r>
+              <w:rPr>
+                <w:rFonts w:ascii="Times New Roman" w:hAnsi="Times New Roman"/>
+                <w:sz w:val="20"/>
+              </w:rPr>
+              <w:t>~95 ns</w:t>
+            </w:r>
+          </w:p>
+        </w:tc>
+        <w:tc>
+          <w:tcPr>
+            <w:tcW w:type="dxa" w:w="3041"/>
+          </w:tcPr>
+          <w:p>
+            <w:r>
+              <w:rPr>
+                <w:rFonts w:ascii="Times New Roman" w:hAnsi="Times New Roman"/>
+                <w:sz w:val="20"/>
+              </w:rPr>
+              <w:t>~150 ns</w:t>
+            </w:r>
+          </w:p>
+        </w:tc>
+      </w:tr>
+      <w:tr>
+        <w:tc>
+          <w:tcPr>
+            <w:tcW w:type="dxa" w:w="3041"/>
+          </w:tcPr>
+          <w:p>
+            <w:r>
+              <w:rPr>
+                <w:rFonts w:ascii="Times New Roman" w:hAnsi="Times New Roman"/>
+                <w:sz w:val="20"/>
+              </w:rPr>
+              <w:t>Modo parcial (fase ligada)</w:t>
+            </w:r>
+          </w:p>
+        </w:tc>
+        <w:tc>
+          <w:tcPr>
+            <w:tcW w:type="dxa" w:w="3041"/>
+          </w:tcPr>
+          <w:p>
+            <w:r>
+              <w:rPr>
+                <w:rFonts w:ascii="Times New Roman" w:hAnsi="Times New Roman"/>
+                <w:sz w:val="20"/>
+              </w:rPr>
+              <w:t>nenhum</w:t>
+            </w:r>
+          </w:p>
+        </w:tc>
+        <w:tc>
+          <w:tcPr>
+            <w:tcW w:type="dxa" w:w="3041"/>
+          </w:tcPr>
+          <w:p>
+            <w:r>
+              <w:rPr>
+                <w:rFonts w:ascii="Times New Roman" w:hAnsi="Times New Roman"/>
+                <w:sz w:val="20"/>
+              </w:rPr>
+              <w:t>His + Ser + S1 borderline</w:t>
+            </w:r>
+          </w:p>
+        </w:tc>
+      </w:tr>
+    </w:tbl>
+    <w:p>
+      <w:pPr/>
+    </w:p>
+    <w:p>
+      <w:pPr>
+        <w:jc w:val="both"/>
+      </w:pPr>
+      <w:r>
+        <w:t>O aumento de 58% no tempo de residência de QCL936-BEN em relação ao ACR157-BEN (150 vs 95 ns) é coerente com a maior complementaridade eletrostática proporcionada pelo Asp241, que permite a formação transitória da ponte salina canônica da benzamidina. Contudo, a dissociação antes dos 200 ns demonstra que essa interação é insuficiente para ancorar BEN de forma sustentada nas condições fisiológicas do intestino médio larval (pH 8,2, 300 K).</w:t>
+      </w:r>
+    </w:p>
+    <w:p>
+      <w:pPr/>
+    </w:p>
+    <w:p>
+      <w:pPr>
         <w:pStyle w:val="Heading2"/>
       </w:pPr>
       <w:r>

</xml_diff>

<commit_message>
docs(artigo+pptx): §2.7-2.8 ProLIF/contact_map + §3.5 fingerprints + slide ProLIF v2
- §2.7: metodologia ProLIF (Bouysset & Fiorucci 2021) + MDAnalysis 2.10
- §2.8: metodologia contact maps (heatmap clustermap Ward)
- §3.5.1: resultados GORE4 — LYS303-ALA242 100% (QCL936), ALA256-GLY228 52% (ACR157), LEU280-HID86 18-21% (XP273)
- §3.5.2: resultados SKTI — ARG317 100% canônico (ACR157), bipartite ARG361+ARG363 (QCL936), ARG344-HID86 58% nova descoberta XP273
- §3.5.3: integração mecanística + 5 achados vs literatura (Krowarsch 2003, Bouysset 2021)
- Tabelas 5+6: top interações ProLIF por sistema
- 9 novas referências (Bouysset, Krowarsch, Laskowski, Michaud-Agrawal, Perona, Scheidig, Sousa da Silva, Wang)
- artigo_md.docx regenerado
- apresentacao_md_spodoptera_v2.pptx: slide 12 ProLIF com 20 interações (GORE4+SKTI), barra de conclusões

Co-Authored-By: Claude Sonnet 4.6 <noreply@anthropic.com>
</commit_message>
<xml_diff>
--- a/artigo_md.docx
+++ b/artigo_md.docx
@@ -564,6 +564,92 @@
       </w:r>
       <w:r>
         <w:t>, 2017) para garantir reprodutibilidade e rastreabilidade computacional.</w:t>
+      </w:r>
+    </w:p>
+    <w:p>
+      <w:pPr>
+        <w:pStyle w:val="Heading3"/>
+      </w:pPr>
+      <w:r>
+        <w:t>2.7 Fingerprints de interação molecular (ProLIF)</w:t>
+      </w:r>
+    </w:p>
+    <w:p>
+      <w:pPr>
+        <w:jc w:val="both"/>
+      </w:pPr>
+      <w:r>
+        <w:t>Para quantificar a persistência temporal e tipificação atômica das interações receptor–ligante ao longo das trajetórias, foi utilizado o pacote ProLIF 2.x (</w:t>
+      </w:r>
+      <w:r>
+        <w:rPr>
+          <w:i/>
+        </w:rPr>
+        <w:t>Protein–Ligand Interaction Fingerprints</w:t>
+      </w:r>
+      <w:r>
+        <w:t xml:space="preserve">; Bouysset &amp; Fiorucci, 2021), integrado ao MDAnalysis 2.10.x (Michaud-Agrawal </w:t>
+      </w:r>
+      <w:r>
+        <w:rPr>
+          <w:i/>
+        </w:rPr>
+        <w:t>et al.</w:t>
+      </w:r>
+      <w:r>
+        <w:t>, 2011). Para cada sistema, foram identificadas todas as interações do tipo Doadora de HB, Aceptora de HB, Hidrofóbica, Catiônica, Aniônica, Empilhamento π–π, Cátion–π e Contato VdW entre pares resíduo(ligante)–resíduo(receptor), dentro de raio de corte de 0,4 nm. A análise foi conduzida com passo de 10 frames (amostragem efetiva de 1 frame/ns) sobre a trajetória completa de produção. A persistência de cada interação foi definida como a porcentagem de frames em que o critério geométrico da interação é satisfeito.</w:t>
+      </w:r>
+    </w:p>
+    <w:p>
+      <w:pPr>
+        <w:jc w:val="both"/>
+      </w:pPr>
+      <w:r>
+        <w:t xml:space="preserve">A análise ProLIF foi aplicada aos sete sistemas estáveis da série peptídeo (três GORE4 e três SKTI), além do complexo XP352-GORE4 (para confirmação de instabilidade). A série BEN foi excluída desta análise por restrição do conversor molecular RDKit: o arquivo de índice </w:t>
+      </w:r>
+      <w:r>
+        <w:rPr>
+          <w:rFonts w:ascii="Courier New" w:hAnsi="Courier New"/>
+          <w:sz w:val="20"/>
+        </w:rPr>
+        <w:t>lig.ndx</w:t>
+      </w:r>
+      <w:r>
+        <w:t xml:space="preserve"> gerado pelo protocolo GAFF2 para a benzamidina contém exclusivamente os 12 átomos pesados (sem hidrogênios explícitos na topologia de índice), impedindo a conversão molecular requerida pelo ProLIF sem perda de integridade das interações dependentes de H (doadora/aceptora de HB).</w:t>
+      </w:r>
+    </w:p>
+    <w:p>
+      <w:pPr>
+        <w:pStyle w:val="Heading3"/>
+      </w:pPr>
+      <w:r>
+        <w:t>2.8 Mapas de contato resíduo × resíduo</w:t>
+      </w:r>
+    </w:p>
+    <w:p>
+      <w:pPr>
+        <w:jc w:val="both"/>
+      </w:pPr>
+      <w:r>
+        <w:t xml:space="preserve">Mapas de frequência de contato resíduo × resíduo foram calculados para todos os 11 sistemas — incluindo a série BEN — utilizando MDAnalysis 2.10.x. Para cada par resíduo(receptor)–resíduo(ligante), a frequência de contato foi definida como a fração de frames em que ao menos um par atômico inter-residual apresenta distância &lt; 0,4 nm. Os mapas foram representados como </w:t>
+      </w:r>
+      <w:r>
+        <w:rPr>
+          <w:i/>
+        </w:rPr>
+        <w:t>heatmaps</w:t>
+      </w:r>
+      <w:r>
+        <w:t xml:space="preserve"> (Seaborn 0.13.x, </w:t>
+      </w:r>
+      <w:r>
+        <w:rPr>
+          <w:i/>
+        </w:rPr>
+        <w:t>clustermap</w:t>
+      </w:r>
+      <w:r>
+        <w:t xml:space="preserve"> com agrupamento hierárquico, ligação Ward), permitindo identificação visual dos resíduos mais frequentemente engajados na interface ao longo de toda a trajetória.</w:t>
       </w:r>
     </w:p>
     <w:p>
@@ -2781,7 +2867,7 @@
                 <w:rFonts w:ascii="Times New Roman" w:hAnsi="Times New Roman"/>
                 <w:sz w:val="20"/>
               </w:rPr>
-              <w:t>—</w:t>
+              <w:t>200 ns</w:t>
             </w:r>
           </w:p>
         </w:tc>
@@ -2795,7 +2881,7 @@
                 <w:rFonts w:ascii="Times New Roman" w:hAnsi="Times New Roman"/>
                 <w:sz w:val="20"/>
               </w:rPr>
-              <w:t>—</w:t>
+              <w:t>0,152 ± 0,016</w:t>
             </w:r>
           </w:p>
         </w:tc>
@@ -2809,7 +2895,7 @@
                 <w:rFonts w:ascii="Times New Roman" w:hAnsi="Times New Roman"/>
                 <w:sz w:val="20"/>
               </w:rPr>
-              <w:t>—</w:t>
+              <w:t>N.D.ª</w:t>
             </w:r>
           </w:p>
         </w:tc>
@@ -2823,7 +2909,7 @@
                 <w:rFonts w:ascii="Times New Roman" w:hAnsi="Times New Roman"/>
                 <w:sz w:val="20"/>
               </w:rPr>
-              <w:t>—</w:t>
+              <w:t>55,5 ± 38,2</w:t>
             </w:r>
           </w:p>
         </w:tc>
@@ -2837,7 +2923,7 @@
                 <w:rFonts w:ascii="Times New Roman" w:hAnsi="Times New Roman"/>
                 <w:sz w:val="20"/>
               </w:rPr>
-              <w:t>—</w:t>
+              <w:t>N.D.ᵇ</w:t>
             </w:r>
           </w:p>
         </w:tc>
@@ -2851,7 +2937,7 @@
                 <w:rFonts w:ascii="Times New Roman" w:hAnsi="Times New Roman"/>
                 <w:sz w:val="20"/>
               </w:rPr>
-              <w:t>—</w:t>
+              <w:t>2,78 ± 0,143</w:t>
             </w:r>
           </w:p>
         </w:tc>
@@ -2865,7 +2951,7 @@
                 <w:rFonts w:ascii="Times New Roman" w:hAnsi="Times New Roman"/>
                 <w:sz w:val="20"/>
               </w:rPr>
-              <w:t>pendente</w:t>
+              <w:t>dissociação ~80 ns</w:t>
             </w:r>
           </w:p>
         </w:tc>
@@ -2895,7 +2981,7 @@
                 <w:rFonts w:ascii="Times New Roman" w:hAnsi="Times New Roman"/>
                 <w:sz w:val="20"/>
               </w:rPr>
-              <w:t>—</w:t>
+              <w:t>200 ns</w:t>
             </w:r>
           </w:p>
         </w:tc>
@@ -2909,7 +2995,7 @@
                 <w:rFonts w:ascii="Times New Roman" w:hAnsi="Times New Roman"/>
                 <w:sz w:val="20"/>
               </w:rPr>
-              <w:t>—</w:t>
+              <w:t>0,213 ± 0,021</w:t>
             </w:r>
           </w:p>
         </w:tc>
@@ -2923,7 +3009,7 @@
                 <w:rFonts w:ascii="Times New Roman" w:hAnsi="Times New Roman"/>
                 <w:sz w:val="20"/>
               </w:rPr>
-              <w:t>—</w:t>
+              <w:t>N.D.ª</w:t>
             </w:r>
           </w:p>
         </w:tc>
@@ -2937,7 +3023,7 @@
                 <w:rFonts w:ascii="Times New Roman" w:hAnsi="Times New Roman"/>
                 <w:sz w:val="20"/>
               </w:rPr>
-              <w:t>—</w:t>
+              <w:t>52,2 ± 47,1</w:t>
             </w:r>
           </w:p>
         </w:tc>
@@ -2951,7 +3037,7 @@
                 <w:rFonts w:ascii="Times New Roman" w:hAnsi="Times New Roman"/>
                 <w:sz w:val="20"/>
               </w:rPr>
-              <w:t>—</w:t>
+              <w:t>N.D.ᵇ</w:t>
             </w:r>
           </w:p>
         </w:tc>
@@ -2965,7 +3051,7 @@
                 <w:rFonts w:ascii="Times New Roman" w:hAnsi="Times New Roman"/>
                 <w:sz w:val="20"/>
               </w:rPr>
-              <w:t>—</w:t>
+              <w:t>2,78 ± 0,140</w:t>
             </w:r>
           </w:p>
         </w:tc>
@@ -2979,7 +3065,7 @@
                 <w:rFonts w:ascii="Times New Roman" w:hAnsi="Times New Roman"/>
                 <w:sz w:val="20"/>
               </w:rPr>
-              <w:t>pendente</w:t>
+              <w:t>dissociação ~125 ns</w:t>
             </w:r>
           </w:p>
         </w:tc>
@@ -4146,6 +4232,178 @@
           </w:p>
         </w:tc>
       </w:tr>
+      <w:tr>
+        <w:tc>
+          <w:tcPr>
+            <w:tcW w:type="dxa" w:w="1520"/>
+          </w:tcPr>
+          <w:p>
+            <w:r>
+              <w:rPr>
+                <w:rFonts w:ascii="Times New Roman" w:hAnsi="Times New Roman"/>
+                <w:sz w:val="20"/>
+              </w:rPr>
+              <w:t>XP273-BEN</w:t>
+            </w:r>
+          </w:p>
+        </w:tc>
+        <w:tc>
+          <w:tcPr>
+            <w:tcW w:type="dxa" w:w="1520"/>
+          </w:tcPr>
+          <w:p>
+            <w:r>
+              <w:rPr>
+                <w:rFonts w:ascii="Times New Roman" w:hAnsi="Times New Roman"/>
+                <w:sz w:val="20"/>
+              </w:rPr>
+              <w:t>Tyr83 ~2,5ᶠ</w:t>
+            </w:r>
+          </w:p>
+        </w:tc>
+        <w:tc>
+          <w:tcPr>
+            <w:tcW w:type="dxa" w:w="1520"/>
+          </w:tcPr>
+          <w:p>
+            <w:r>
+              <w:rPr>
+                <w:rFonts w:ascii="Times New Roman" w:hAnsi="Times New Roman"/>
+                <w:sz w:val="20"/>
+              </w:rPr>
+              <w:t>Asp132 ~2,5ᶠ</w:t>
+            </w:r>
+          </w:p>
+        </w:tc>
+        <w:tc>
+          <w:tcPr>
+            <w:tcW w:type="dxa" w:w="1520"/>
+          </w:tcPr>
+          <w:p>
+            <w:r>
+              <w:rPr>
+                <w:rFonts w:ascii="Times New Roman" w:hAnsi="Times New Roman"/>
+                <w:sz w:val="20"/>
+              </w:rPr>
+              <w:t>Ser234 ~2,5ᶠ</w:t>
+            </w:r>
+          </w:p>
+        </w:tc>
+        <w:tc>
+          <w:tcPr>
+            <w:tcW w:type="dxa" w:w="1520"/>
+          </w:tcPr>
+          <w:p>
+            <w:r>
+              <w:rPr>
+                <w:rFonts w:ascii="Times New Roman" w:hAnsi="Times New Roman"/>
+                <w:sz w:val="20"/>
+              </w:rPr>
+              <w:t>Ile229 ~2,0ᶠ</w:t>
+            </w:r>
+          </w:p>
+        </w:tc>
+        <w:tc>
+          <w:tcPr>
+            <w:tcW w:type="dxa" w:w="1520"/>
+          </w:tcPr>
+          <w:p>
+            <w:r>
+              <w:rPr>
+                <w:rFonts w:ascii="Times New Roman" w:hAnsi="Times New Roman"/>
+                <w:sz w:val="20"/>
+              </w:rPr>
+              <w:t>Dissociação (~80 ns)</w:t>
+            </w:r>
+          </w:p>
+        </w:tc>
+      </w:tr>
+      <w:tr>
+        <w:tc>
+          <w:tcPr>
+            <w:tcW w:type="dxa" w:w="1520"/>
+          </w:tcPr>
+          <w:p>
+            <w:r>
+              <w:rPr>
+                <w:rFonts w:ascii="Times New Roman" w:hAnsi="Times New Roman"/>
+                <w:sz w:val="20"/>
+              </w:rPr>
+              <w:t>XP352-BEN</w:t>
+            </w:r>
+          </w:p>
+        </w:tc>
+        <w:tc>
+          <w:tcPr>
+            <w:tcW w:type="dxa" w:w="1520"/>
+          </w:tcPr>
+          <w:p>
+            <w:r>
+              <w:rPr>
+                <w:rFonts w:ascii="Times New Roman" w:hAnsi="Times New Roman"/>
+                <w:sz w:val="20"/>
+              </w:rPr>
+              <w:t>Arg112 ~2,0ᵍ</w:t>
+            </w:r>
+          </w:p>
+        </w:tc>
+        <w:tc>
+          <w:tcPr>
+            <w:tcW w:type="dxa" w:w="1520"/>
+          </w:tcPr>
+          <w:p>
+            <w:r>
+              <w:rPr>
+                <w:rFonts w:ascii="Times New Roman" w:hAnsi="Times New Roman"/>
+                <w:sz w:val="20"/>
+              </w:rPr>
+              <w:t>Asp166 ~2,0ᵍ</w:t>
+            </w:r>
+          </w:p>
+        </w:tc>
+        <w:tc>
+          <w:tcPr>
+            <w:tcW w:type="dxa" w:w="1520"/>
+          </w:tcPr>
+          <w:p>
+            <w:r>
+              <w:rPr>
+                <w:rFonts w:ascii="Times New Roman" w:hAnsi="Times New Roman"/>
+                <w:sz w:val="20"/>
+              </w:rPr>
+              <w:t>Ser268 ~2,5ᵍ</w:t>
+            </w:r>
+          </w:p>
+        </w:tc>
+        <w:tc>
+          <w:tcPr>
+            <w:tcW w:type="dxa" w:w="1520"/>
+          </w:tcPr>
+          <w:p>
+            <w:r>
+              <w:rPr>
+                <w:rFonts w:ascii="Times New Roman" w:hAnsi="Times New Roman"/>
+                <w:sz w:val="20"/>
+              </w:rPr>
+              <w:t>Asp262 ~1,5ᵍ</w:t>
+            </w:r>
+          </w:p>
+        </w:tc>
+        <w:tc>
+          <w:tcPr>
+            <w:tcW w:type="dxa" w:w="1520"/>
+          </w:tcPr>
+          <w:p>
+            <w:r>
+              <w:rPr>
+                <w:rFonts w:ascii="Times New Roman" w:hAnsi="Times New Roman"/>
+                <w:sz w:val="20"/>
+              </w:rPr>
+              <w:t>Dissociação (~125 ns)</w:t>
+            </w:r>
+          </w:p>
+        </w:tc>
+      </w:tr>
     </w:tbl>
     <w:p>
       <w:pPr/>
@@ -4182,6 +4440,22 @@
     </w:p>
     <w:p>
       <w:pPr>
+        <w:jc w:val="both"/>
+      </w:pPr>
+      <w:r>
+        <w:t>ᶠ Médias sobre 200 ns incluindo fase dissociada (80–200 ns); fase pré-dissociação (0–80 ns): todos &gt;0,50 nm ❌; ausência de âncora eletrostática (Ile229 neutro no S1).</w:t>
+      </w:r>
+    </w:p>
+    <w:p>
+      <w:pPr>
+        <w:jc w:val="both"/>
+      </w:pPr>
+      <w:r>
+        <w:t>ᵍ Médias sobre 200 ns incluindo fase dissociada (125–200 ns); fase pré-dissociação (0–125 ns): Asp262 ~0,45 nm ⚠️ (ponte salina transitória), demais &gt;0,80 nm ❌.</w:t>
+      </w:r>
+    </w:p>
+    <w:p>
+      <w:pPr>
         <w:pStyle w:val="Heading4"/>
       </w:pPr>
       <w:r>
@@ -4280,10 +4554,37 @@
         <w:rPr>
           <w:b/>
         </w:rPr>
-        <w:t>Não-ligante</w:t>
-      </w:r>
-      <w:r>
-        <w:t xml:space="preserve"> (ACR157-BEN) — dissociação completa antes de 100 ns; nenhum resíduo catalítico engajado de forma estável; ausência de inibição viável nas condições avaliadas.</w:t>
+        <w:t>Controle BEN — dissociação transitória universal</w:t>
+      </w:r>
+      <w:r>
+        <w:t xml:space="preserve"> (todos os quatro receptores, 80–150 ns) — nenhum dos sistemas manteve BEN ligada ao longo de 200 ns. Dois sub-padrões são distinguíveis: (a) </w:t>
+      </w:r>
+      <w:r>
+        <w:rPr>
+          <w:b/>
+        </w:rPr>
+        <w:t>Ile no S1</w:t>
+      </w:r>
+      <w:r>
+        <w:t xml:space="preserve"> (ACR157: Ile205; XP273: Ile229) — dissociação a ~80–95 ns sem âncora eletrostática, sem contato catalítico direto em qualquer resíduo; (b) </w:t>
+      </w:r>
+      <w:r>
+        <w:rPr>
+          <w:b/>
+        </w:rPr>
+        <w:t>Asp no S1</w:t>
+      </w:r>
+      <w:r>
+        <w:t xml:space="preserve"> (QCL936: Asp241; XP352: Asp262) — dissociação a ~125–150 ns com ponte salina amidínio⁺↔Asp²⁻ transitória que prolonga a residência em ~50–55%. A benzamidina é ineficaz como inibidor das tripsinas de </w:t>
+      </w:r>
+      <w:r>
+        <w:rPr>
+          <w:i/>
+        </w:rPr>
+        <w:t>Spodoptera</w:t>
+      </w:r>
+      <w:r>
+        <w:t xml:space="preserve"> em condições fisiológicas de pH 8,2, 300 K.</w:t>
       </w:r>
     </w:p>
     <w:p>
@@ -4291,7 +4592,16 @@
         <w:jc w:val="both"/>
       </w:pPr>
       <w:r>
-        <w:t>A série SKTI supera consistentemente a série GORE4 em todos os parâmetros de interface (contatos 2,1–4,0×; H-bonds 2,8–7,1×; RMSD do ligante inferior) e em profundidade de engajamento catalítico. A benzamidina, embora controle positivo estrutural estabelecido para tripsinas de mamíferos, revelou-se incapaz de manter ligação estável com ACR157 sob condições fisiológicas de inseto (pH 8,2, 300 K), provavelmente em razão da ausência de Asp no bolsão S1 desse receptor (Ile205, não-carregado).</w:t>
+        <w:t xml:space="preserve">A série SKTI supera consistentemente a série GORE4 em todos os parâmetros de interface (contatos 2,1–4,0×; H-bonds 2,8–7,1×; RMSD do ligante inferior) e em profundidade de engajamento catalítico. A benzamidina, embora controle positivo estrutural estabelecido para tripsinas de mamíferos, revelou-se universalmente instável nos quatro receptores de </w:t>
+      </w:r>
+      <w:r>
+        <w:rPr>
+          <w:i/>
+        </w:rPr>
+        <w:t>Spodoptera</w:t>
+      </w:r>
+      <w:r>
+        <w:t xml:space="preserve"> sob condições fisiológicas de inseto (pH 8,2, 300 K): dissociação ocorreu entre ~80 ns (XP273) e ~150 ns (QCL936), com o tempo de residência determinado pela natureza do resíduo no bolsão S1 (Asp carregado prolonga; Ile neutro encurta). Este controle negativo reforça o valor dos peptídeos da série GORE4 e do SKTI, que mantiveram ligação estável por 100 ns completos em todos os sistemas que não sofreram dissociação.</w:t>
       </w:r>
     </w:p>
     <w:p>
@@ -5405,19 +5715,665 @@
     </w:p>
     <w:p>
       <w:pPr>
-        <w:pStyle w:val="Heading2"/>
-      </w:pPr>
-      <w:r>
-        <w:t>Referências (a inserir)</w:t>
+        <w:pStyle w:val="Heading3"/>
+      </w:pPr>
+      <w:r>
+        <w:t>3.4.4 Dinâmica molecular de benzamidina — XP273-BEN (200 ns)</w:t>
       </w:r>
     </w:p>
     <w:p>
       <w:pPr>
-        <w:pStyle w:val="ListBullet"/>
-        <w:spacing w:after="60"/>
-      </w:pPr>
-      <w:r>
-        <w:t xml:space="preserve">Abraham, M.J. </w:t>
+        <w:jc w:val="both"/>
+      </w:pPr>
+      <w:r>
+        <w:t>O complexo XP273-BEN foi simulado por 200 ns com a pose inicial correspondente ao modo 1 do docking Vina (score −5,484 kcal/mol, 2° entre os quatro receptores). O XP273 apresenta Ile229 no bolsão S1 — mesmo tipo de resíduo neutro que o ACR157 (Ile205) — mas obteve escore Vina superior, atribuído a maior convergência de poses e maior número de contatos próximos (2/4 resíduos a &lt; 0,35 nm no docking, versus 1/4 no ACR157). O receptor XP273 é também atípico por apresentar Tyr83 no lugar da His canônica na posição triad_1, alterando a topografia eletrostática da região de entrada do sítio catalítico.</w:t>
+      </w:r>
+    </w:p>
+    <w:p>
+      <w:pPr>
+        <w:pStyle w:val="Heading4"/>
+      </w:pPr>
+      <w:r>
+        <w:t>Estabilidade do receptor</w:t>
+      </w:r>
+    </w:p>
+    <w:p>
+      <w:pPr>
+        <w:jc w:val="both"/>
+      </w:pPr>
+      <w:r>
+        <w:t>O RMSD do backbone do XP273 estabilizou em 0,152 ± 0,016 nm — valor próximo ao do ACR157-BEN (0,146 nm) —, confirmando integridade estrutural do receptor durante toda a trajetória. O raio de giro manteve-se em 1,711 ± 0,010 nm com variabilidade mínima.</w:t>
+      </w:r>
+    </w:p>
+    <w:p>
+      <w:pPr>
+        <w:pStyle w:val="Heading4"/>
+      </w:pPr>
+      <w:r>
+        <w:t>Evento de dissociação a ~80 ns</w:t>
+      </w:r>
+    </w:p>
+    <w:p>
+      <w:pPr>
+        <w:jc w:val="both"/>
+      </w:pPr>
+      <w:r>
+        <w:t>A fase de associação inicial foi marcada por contatos fracos e variáveis. O número médio de contatos receptor–ligante ao longo dos 200 ns foi de 55,5 ± 38,2 átomos (SD/média = 69%), distribuição bimodal evidenciando dois estados predominantes: fase ligada fraca (0–80 ns) e estado dissociado (80–200 ns). A análise das distâncias mínimas revelou que, durante a fase de associação (0–80 ns), nenhum dos quatro resíduos catalíticos monitorados (Tyr83, Asp132, Ser234, Ile229) atingiu distância inferior a 0,5 nm de forma estável — contraste marcado com o QCL936-BEN (His92 e Ser247 em contato direto durante 0–150 ns). Este resultado é mecanisticamente coerente com a ausência de Asp no bolsão S1: o Ile229 (resíduo neutro) não forma ponte salina com o grupo amidínio de BEN (+1), eliminando a âncora eletrostática primária.</w:t>
+      </w:r>
+    </w:p>
+    <w:p>
+      <w:pPr>
+        <w:jc w:val="both"/>
+      </w:pPr>
+      <w:r>
+        <w:t>A dissociação ocorreu a ~80 ns — anteriormente ao ACR157-BEN (~95 ns), embora ambos compartilhem Ile neutro no S1. A diferença de ~15 ns no tempo de residência é atribuída à geometria diferencial entre os sítios ativos: a presença de Tyr83 no lugar da His canônica altera a topografia eletrostática da entrada do sítio e reduz a complementaridade com o ligante aminoaromático. Após a dissociação, todas as distâncias catalíticas saltaram para &gt; 3 nm e permaneceram elevadas até o final da trajetória.</w:t>
+      </w:r>
+    </w:p>
+    <w:p>
+      <w:pPr>
+        <w:jc w:val="both"/>
+      </w:pPr>
+      <w:r>
+        <w:t>A SASA da BEN manteve-se em 2,782 ± 0,143 nm². As médias globais das distâncias catalíticas (integradas sobre 200 ns) foram superiores a 2,0 nm para todos os resíduos, refletindo o predomínio do estado dissociado.</w:t>
+      </w:r>
+    </w:p>
+    <w:p>
+      <w:pPr/>
+    </w:p>
+    <w:p>
+      <w:pPr>
+        <w:pStyle w:val="Heading3"/>
+      </w:pPr>
+      <w:r>
+        <w:t>3.4.5 Dinâmica molecular de benzamidina — XP352-BEN (200 ns)</w:t>
+      </w:r>
+    </w:p>
+    <w:p>
+      <w:pPr>
+        <w:jc w:val="both"/>
+      </w:pPr>
+      <w:r>
+        <w:t>O complexo XP352-BEN foi simulado por 200 ns com a pose inicial correspondente ao modo 1 do docking Vina (score −4,975 kcal/mol, 3°). O receptor XP352 apresenta Asp262 no bolsão S1 — resíduo carregado negativamente, análogo ao Asp241 do QCL936 —, o que o torna, em princípio, compatível com a ponte salina amidínio⁺↔Asp²⁻ canônica da benzamidina. O receptor utilizado nesta simulação corresponde ao snapshot pós-DM do complexo XP352-GORE4, no qual a isoforma havia apresentado dissociação precoce do peptídeo e desvio conformacional significativo (RMSD backbone = 0,886 nm naquela trajetória).</w:t>
+      </w:r>
+    </w:p>
+    <w:p>
+      <w:pPr>
+        <w:pStyle w:val="Heading4"/>
+      </w:pPr>
+      <w:r>
+        <w:t>Estabilidade do receptor</w:t>
+      </w:r>
+    </w:p>
+    <w:p>
+      <w:pPr>
+        <w:jc w:val="both"/>
+      </w:pPr>
+      <w:r>
+        <w:t>O RMSD do backbone do XP352 estabilizou em 0,213 ± 0,021 nm — o mais elevado entre os quatro sistemas BEN avaliados, reflexo direto da prévia deformação conformacional durante o run GORE4. Apesar disso, o receptor atingiu novo equilíbrio estrutural estável durante a simulação BEN, sem desvio progressivo ao longo dos 200 ns. O raio de giro manteve-se em 1,745 ± 0,011 nm.</w:t>
+      </w:r>
+    </w:p>
+    <w:p>
+      <w:pPr>
+        <w:pStyle w:val="Heading4"/>
+      </w:pPr>
+      <w:r>
+        <w:t>Fase de ligação com ancoragem S1 transitória (0–125 ns)</w:t>
+      </w:r>
+    </w:p>
+    <w:p>
+      <w:pPr>
+        <w:jc w:val="both"/>
+      </w:pPr>
+      <w:r>
+        <w:t>O número médio de contatos receptor–ligante ao longo dos 200 ns foi de 52,2 ± 47,1 átomos (SD/média = 90%), o maior índice de bimodalidade entre os quatro sistemas BEN. Durante a fase de associação (0–125 ns), a BEN apresentou ancoragem predominantemente no bolsão S1 (Asp262), com distância mínima borderline de ~0,40–0,50 nm — padrão análogo ao observado no QCL936-BEN (Asp241 ~0,40–0,50 nm durante 0–150 ns). Os demais resíduos catalíticos (Arg112, Asp166, Ser268) permaneceram a distâncias &gt; 0,80 nm durante toda a fase ligada, sem contato direto estabelecido.</w:t>
+      </w:r>
+    </w:p>
+    <w:p>
+      <w:pPr>
+        <w:pStyle w:val="Heading4"/>
+      </w:pPr>
+      <w:r>
+        <w:t>Evento de dissociação a ~125 ns</w:t>
+      </w:r>
+    </w:p>
+    <w:p>
+      <w:pPr>
+        <w:jc w:val="both"/>
+      </w:pPr>
+      <w:r>
+        <w:t>A dissociação do complexo XP352-BEN ocorreu progressivamente a partir de ~125 ns, com desengajamento do Asp262/S1 seguido de migração completa de BEN ao solvente. A partir de ~150 ns, todas as distâncias catalíticas ultrapassaram 3 nm e permaneceram elevadas até o final da trajetória. O tempo de residência de ~125 ns posiciona o XP352-BEN dentro do grupo de Asp no S1, com dissociação ~30 ns antes do QCL936-BEN (~150 ns). Esta diferença pode ser atribuída à conformação ligeiramente alterada do sítio ativo do XP352 decorrente da prévia deformação estrutural, com menor complementaridade de encaixe para BEN em relação ao QCL936 nativo.</w:t>
+      </w:r>
+    </w:p>
+    <w:p>
+      <w:pPr>
+        <w:jc w:val="both"/>
+      </w:pPr>
+      <w:r>
+        <w:t>A SASA da BEN manteve-se em 2,784 ± 0,140 nm². O Asp262 apresentou distância média de ~1,5 nm sobre os 200 ns (menor entre os quatro resíduos), refletindo a contribuição da fase ligada (0–125 ns, 62,5% da trajetória) com ancoragem borderline ao bolsão S1.</w:t>
+      </w:r>
+    </w:p>
+    <w:p>
+      <w:pPr/>
+    </w:p>
+    <w:p>
+      <w:pPr>
+        <w:pStyle w:val="Heading3"/>
+      </w:pPr>
+      <w:r>
+        <w:t>3.4.6 Síntese comparativa — série BEN</w:t>
+      </w:r>
+    </w:p>
+    <w:p>
+      <w:pPr>
+        <w:jc w:val="both"/>
+      </w:pPr>
+      <w:r>
+        <w:t xml:space="preserve">A análise dos quatro complexos de benzamidina com tripsinas de </w:t>
+      </w:r>
+      <w:r>
+        <w:rPr>
+          <w:i/>
+        </w:rPr>
+        <w:t>Spodoptera</w:t>
+      </w:r>
+      <w:r>
+        <w:t xml:space="preserve"> em 200 ns de DM revela um padrão de instabilidade universal: nenhum receptor manteve BEN ligada ao longo de toda a trajetória, confirmando que a benzamidina não é um inibidor efetivo das tripsinas de </w:t>
+      </w:r>
+      <w:r>
+        <w:rPr>
+          <w:i/>
+        </w:rPr>
+        <w:t>Spodoptera</w:t>
+      </w:r>
+      <w:r>
+        <w:t xml:space="preserve"> sob condições fisiológicas de intestino médio larval (pH 8,2, 300 K, 0,10 M KCl).</w:t>
+      </w:r>
+    </w:p>
+    <w:p>
+      <w:pPr>
+        <w:jc w:val="both"/>
+      </w:pPr>
+      <w:r>
+        <w:t>Os quatro sistemas exibiram dois sub-padrões distintos de dissociação, determinados unicamente pela natureza do resíduo no bolsão de especificidade S1:</w:t>
+      </w:r>
+    </w:p>
+    <w:p>
+      <w:pPr>
+        <w:jc w:val="both"/>
+      </w:pPr>
+      <w:r>
+        <w:rPr>
+          <w:b/>
+        </w:rPr>
+        <w:t>Tabela 4 — Resumo da série BEN: natureza do S1 e tempo de residência</w:t>
+      </w:r>
+    </w:p>
+    <w:tbl>
+      <w:tblPr>
+        <w:tblStyle w:val="TableGrid"/>
+        <w:tblW w:type="auto" w:w="0"/>
+        <w:tblLook w:firstColumn="1" w:firstRow="1" w:lastColumn="0" w:lastRow="0" w:noHBand="0" w:noVBand="1" w:val="04A0"/>
+      </w:tblPr>
+      <w:tblGrid>
+        <w:gridCol w:w="1520"/>
+        <w:gridCol w:w="1520"/>
+        <w:gridCol w:w="1520"/>
+        <w:gridCol w:w="1520"/>
+        <w:gridCol w:w="1520"/>
+        <w:gridCol w:w="1520"/>
+      </w:tblGrid>
+      <w:tr>
+        <w:tc>
+          <w:tcPr>
+            <w:tcW w:type="dxa" w:w="1520"/>
+            <w:shd w:val="clear" w:color="auto" w:fill="D9E1F2"/>
+          </w:tcPr>
+          <w:p>
+            <w:r>
+              <w:rPr>
+                <w:rFonts w:ascii="Times New Roman" w:hAnsi="Times New Roman"/>
+                <w:b/>
+                <w:sz w:val="20"/>
+              </w:rPr>
+              <w:t>S1 (receptor)</w:t>
+            </w:r>
+          </w:p>
+        </w:tc>
+        <w:tc>
+          <w:tcPr>
+            <w:tcW w:type="dxa" w:w="1520"/>
+            <w:shd w:val="clear" w:color="auto" w:fill="D9E1F2"/>
+          </w:tcPr>
+          <w:p>
+            <w:r>
+              <w:rPr>
+                <w:rFonts w:ascii="Times New Roman" w:hAnsi="Times New Roman"/>
+                <w:b/>
+                <w:sz w:val="20"/>
+              </w:rPr>
+              <w:t>Receptor</w:t>
+            </w:r>
+          </w:p>
+        </w:tc>
+        <w:tc>
+          <w:tcPr>
+            <w:tcW w:type="dxa" w:w="1520"/>
+            <w:shd w:val="clear" w:color="auto" w:fill="D9E1F2"/>
+          </w:tcPr>
+          <w:p>
+            <w:r>
+              <w:rPr>
+                <w:rFonts w:ascii="Times New Roman" w:hAnsi="Times New Roman"/>
+                <w:b/>
+                <w:sz w:val="20"/>
+              </w:rPr>
+              <w:t>Score Vina (kcal/mol)</w:t>
+            </w:r>
+          </w:p>
+        </w:tc>
+        <w:tc>
+          <w:tcPr>
+            <w:tcW w:type="dxa" w:w="1520"/>
+            <w:shd w:val="clear" w:color="auto" w:fill="D9E1F2"/>
+          </w:tcPr>
+          <w:p>
+            <w:r>
+              <w:rPr>
+                <w:rFonts w:ascii="Times New Roman" w:hAnsi="Times New Roman"/>
+                <w:b/>
+                <w:sz w:val="20"/>
+              </w:rPr>
+              <w:t>RMSD bb (nm)</w:t>
+            </w:r>
+          </w:p>
+        </w:tc>
+        <w:tc>
+          <w:tcPr>
+            <w:tcW w:type="dxa" w:w="1520"/>
+            <w:shd w:val="clear" w:color="auto" w:fill="D9E1F2"/>
+          </w:tcPr>
+          <w:p>
+            <w:r>
+              <w:rPr>
+                <w:rFonts w:ascii="Times New Roman" w:hAnsi="Times New Roman"/>
+                <w:b/>
+                <w:sz w:val="20"/>
+              </w:rPr>
+              <w:t>Contatos (média ± DP)</w:t>
+            </w:r>
+          </w:p>
+        </w:tc>
+        <w:tc>
+          <w:tcPr>
+            <w:tcW w:type="dxa" w:w="1520"/>
+            <w:shd w:val="clear" w:color="auto" w:fill="D9E1F2"/>
+          </w:tcPr>
+          <w:p>
+            <w:r>
+              <w:rPr>
+                <w:rFonts w:ascii="Times New Roman" w:hAnsi="Times New Roman"/>
+                <w:b/>
+                <w:sz w:val="20"/>
+              </w:rPr>
+              <w:t>Dissociação</w:t>
+            </w:r>
+          </w:p>
+        </w:tc>
+      </w:tr>
+      <w:tr>
+        <w:tc>
+          <w:tcPr>
+            <w:tcW w:type="dxa" w:w="1520"/>
+          </w:tcPr>
+          <w:p>
+            <w:r>
+              <w:rPr>
+                <w:rFonts w:ascii="Times New Roman" w:hAnsi="Times New Roman"/>
+                <w:sz w:val="20"/>
+              </w:rPr>
+              <w:t>Ile (neutro)</w:t>
+            </w:r>
+          </w:p>
+        </w:tc>
+        <w:tc>
+          <w:tcPr>
+            <w:tcW w:type="dxa" w:w="1520"/>
+          </w:tcPr>
+          <w:p>
+            <w:r>
+              <w:rPr>
+                <w:rFonts w:ascii="Times New Roman" w:hAnsi="Times New Roman"/>
+                <w:sz w:val="20"/>
+              </w:rPr>
+              <w:t>XP273 (Ile229)</w:t>
+            </w:r>
+          </w:p>
+        </w:tc>
+        <w:tc>
+          <w:tcPr>
+            <w:tcW w:type="dxa" w:w="1520"/>
+          </w:tcPr>
+          <w:p>
+            <w:r>
+              <w:rPr>
+                <w:rFonts w:ascii="Times New Roman" w:hAnsi="Times New Roman"/>
+                <w:sz w:val="20"/>
+              </w:rPr>
+              <w:t>−5,484</w:t>
+            </w:r>
+          </w:p>
+        </w:tc>
+        <w:tc>
+          <w:tcPr>
+            <w:tcW w:type="dxa" w:w="1520"/>
+          </w:tcPr>
+          <w:p>
+            <w:r>
+              <w:rPr>
+                <w:rFonts w:ascii="Times New Roman" w:hAnsi="Times New Roman"/>
+                <w:sz w:val="20"/>
+              </w:rPr>
+              <w:t>0,152 ± 0,016</w:t>
+            </w:r>
+          </w:p>
+        </w:tc>
+        <w:tc>
+          <w:tcPr>
+            <w:tcW w:type="dxa" w:w="1520"/>
+          </w:tcPr>
+          <w:p>
+            <w:r>
+              <w:rPr>
+                <w:rFonts w:ascii="Times New Roman" w:hAnsi="Times New Roman"/>
+                <w:sz w:val="20"/>
+              </w:rPr>
+              <w:t>55,5 ± 38,2</w:t>
+            </w:r>
+          </w:p>
+        </w:tc>
+        <w:tc>
+          <w:tcPr>
+            <w:tcW w:type="dxa" w:w="1520"/>
+          </w:tcPr>
+          <w:p>
+            <w:r>
+              <w:rPr>
+                <w:rFonts w:ascii="Times New Roman" w:hAnsi="Times New Roman"/>
+                <w:sz w:val="20"/>
+              </w:rPr>
+              <w:t>~80 ns</w:t>
+            </w:r>
+          </w:p>
+        </w:tc>
+      </w:tr>
+      <w:tr>
+        <w:tc>
+          <w:tcPr>
+            <w:tcW w:type="dxa" w:w="1520"/>
+          </w:tcPr>
+          <w:p>
+            <w:r>
+              <w:rPr>
+                <w:rFonts w:ascii="Times New Roman" w:hAnsi="Times New Roman"/>
+                <w:sz w:val="20"/>
+              </w:rPr>
+              <w:t>Ile (neutro)</w:t>
+            </w:r>
+          </w:p>
+        </w:tc>
+        <w:tc>
+          <w:tcPr>
+            <w:tcW w:type="dxa" w:w="1520"/>
+          </w:tcPr>
+          <w:p>
+            <w:r>
+              <w:rPr>
+                <w:rFonts w:ascii="Times New Roman" w:hAnsi="Times New Roman"/>
+                <w:sz w:val="20"/>
+              </w:rPr>
+              <w:t>ACR157 (Ile205)</w:t>
+            </w:r>
+          </w:p>
+        </w:tc>
+        <w:tc>
+          <w:tcPr>
+            <w:tcW w:type="dxa" w:w="1520"/>
+          </w:tcPr>
+          <w:p>
+            <w:r>
+              <w:rPr>
+                <w:rFonts w:ascii="Times New Roman" w:hAnsi="Times New Roman"/>
+                <w:sz w:val="20"/>
+              </w:rPr>
+              <w:t>−4,953</w:t>
+            </w:r>
+          </w:p>
+        </w:tc>
+        <w:tc>
+          <w:tcPr>
+            <w:tcW w:type="dxa" w:w="1520"/>
+          </w:tcPr>
+          <w:p>
+            <w:r>
+              <w:rPr>
+                <w:rFonts w:ascii="Times New Roman" w:hAnsi="Times New Roman"/>
+                <w:sz w:val="20"/>
+              </w:rPr>
+              <w:t>0,146 ± 0,019</w:t>
+            </w:r>
+          </w:p>
+        </w:tc>
+        <w:tc>
+          <w:tcPr>
+            <w:tcW w:type="dxa" w:w="1520"/>
+          </w:tcPr>
+          <w:p>
+            <w:r>
+              <w:rPr>
+                <w:rFonts w:ascii="Times New Roman" w:hAnsi="Times New Roman"/>
+                <w:sz w:val="20"/>
+              </w:rPr>
+              <w:t>68,8 ± 72,4</w:t>
+            </w:r>
+          </w:p>
+        </w:tc>
+        <w:tc>
+          <w:tcPr>
+            <w:tcW w:type="dxa" w:w="1520"/>
+          </w:tcPr>
+          <w:p>
+            <w:r>
+              <w:rPr>
+                <w:rFonts w:ascii="Times New Roman" w:hAnsi="Times New Roman"/>
+                <w:sz w:val="20"/>
+              </w:rPr>
+              <w:t>~95 ns</w:t>
+            </w:r>
+          </w:p>
+        </w:tc>
+      </w:tr>
+      <w:tr>
+        <w:tc>
+          <w:tcPr>
+            <w:tcW w:type="dxa" w:w="1520"/>
+          </w:tcPr>
+          <w:p>
+            <w:r>
+              <w:rPr>
+                <w:rFonts w:ascii="Times New Roman" w:hAnsi="Times New Roman"/>
+                <w:sz w:val="20"/>
+              </w:rPr>
+              <w:t>Asp (−1)</w:t>
+            </w:r>
+          </w:p>
+        </w:tc>
+        <w:tc>
+          <w:tcPr>
+            <w:tcW w:type="dxa" w:w="1520"/>
+          </w:tcPr>
+          <w:p>
+            <w:r>
+              <w:rPr>
+                <w:rFonts w:ascii="Times New Roman" w:hAnsi="Times New Roman"/>
+                <w:sz w:val="20"/>
+              </w:rPr>
+              <w:t>XP352 (Asp262)</w:t>
+            </w:r>
+          </w:p>
+        </w:tc>
+        <w:tc>
+          <w:tcPr>
+            <w:tcW w:type="dxa" w:w="1520"/>
+          </w:tcPr>
+          <w:p>
+            <w:r>
+              <w:rPr>
+                <w:rFonts w:ascii="Times New Roman" w:hAnsi="Times New Roman"/>
+                <w:sz w:val="20"/>
+              </w:rPr>
+              <w:t>−4,975</w:t>
+            </w:r>
+          </w:p>
+        </w:tc>
+        <w:tc>
+          <w:tcPr>
+            <w:tcW w:type="dxa" w:w="1520"/>
+          </w:tcPr>
+          <w:p>
+            <w:r>
+              <w:rPr>
+                <w:rFonts w:ascii="Times New Roman" w:hAnsi="Times New Roman"/>
+                <w:sz w:val="20"/>
+              </w:rPr>
+              <w:t>0,213 ± 0,021</w:t>
+            </w:r>
+          </w:p>
+        </w:tc>
+        <w:tc>
+          <w:tcPr>
+            <w:tcW w:type="dxa" w:w="1520"/>
+          </w:tcPr>
+          <w:p>
+            <w:r>
+              <w:rPr>
+                <w:rFonts w:ascii="Times New Roman" w:hAnsi="Times New Roman"/>
+                <w:sz w:val="20"/>
+              </w:rPr>
+              <w:t>52,2 ± 47,1</w:t>
+            </w:r>
+          </w:p>
+        </w:tc>
+        <w:tc>
+          <w:tcPr>
+            <w:tcW w:type="dxa" w:w="1520"/>
+          </w:tcPr>
+          <w:p>
+            <w:r>
+              <w:rPr>
+                <w:rFonts w:ascii="Times New Roman" w:hAnsi="Times New Roman"/>
+                <w:sz w:val="20"/>
+              </w:rPr>
+              <w:t>~125 ns</w:t>
+            </w:r>
+          </w:p>
+        </w:tc>
+      </w:tr>
+      <w:tr>
+        <w:tc>
+          <w:tcPr>
+            <w:tcW w:type="dxa" w:w="1520"/>
+          </w:tcPr>
+          <w:p>
+            <w:r>
+              <w:rPr>
+                <w:rFonts w:ascii="Times New Roman" w:hAnsi="Times New Roman"/>
+                <w:sz w:val="20"/>
+              </w:rPr>
+              <w:t>Asp (−1)</w:t>
+            </w:r>
+          </w:p>
+        </w:tc>
+        <w:tc>
+          <w:tcPr>
+            <w:tcW w:type="dxa" w:w="1520"/>
+          </w:tcPr>
+          <w:p>
+            <w:r>
+              <w:rPr>
+                <w:rFonts w:ascii="Times New Roman" w:hAnsi="Times New Roman"/>
+                <w:sz w:val="20"/>
+              </w:rPr>
+              <w:t>QCL936 (Asp241)</w:t>
+            </w:r>
+          </w:p>
+        </w:tc>
+        <w:tc>
+          <w:tcPr>
+            <w:tcW w:type="dxa" w:w="1520"/>
+          </w:tcPr>
+          <w:p>
+            <w:r>
+              <w:rPr>
+                <w:rFonts w:ascii="Times New Roman" w:hAnsi="Times New Roman"/>
+                <w:sz w:val="20"/>
+              </w:rPr>
+              <w:t>−5,733</w:t>
+            </w:r>
+          </w:p>
+        </w:tc>
+        <w:tc>
+          <w:tcPr>
+            <w:tcW w:type="dxa" w:w="1520"/>
+          </w:tcPr>
+          <w:p>
+            <w:r>
+              <w:rPr>
+                <w:rFonts w:ascii="Times New Roman" w:hAnsi="Times New Roman"/>
+                <w:sz w:val="20"/>
+              </w:rPr>
+              <w:t>0,116 ± 0,016</w:t>
+            </w:r>
+          </w:p>
+        </w:tc>
+        <w:tc>
+          <w:tcPr>
+            <w:tcW w:type="dxa" w:w="1520"/>
+          </w:tcPr>
+          <w:p>
+            <w:r>
+              <w:rPr>
+                <w:rFonts w:ascii="Times New Roman" w:hAnsi="Times New Roman"/>
+                <w:sz w:val="20"/>
+              </w:rPr>
+              <w:t>90,1 ± 43,6</w:t>
+            </w:r>
+          </w:p>
+        </w:tc>
+        <w:tc>
+          <w:tcPr>
+            <w:tcW w:type="dxa" w:w="1520"/>
+          </w:tcPr>
+          <w:p>
+            <w:r>
+              <w:rPr>
+                <w:rFonts w:ascii="Times New Roman" w:hAnsi="Times New Roman"/>
+                <w:sz w:val="20"/>
+              </w:rPr>
+              <w:t>~150 ns</w:t>
+            </w:r>
+          </w:p>
+        </w:tc>
+      </w:tr>
+    </w:tbl>
+    <w:p>
+      <w:pPr/>
+    </w:p>
+    <w:p>
+      <w:pPr>
+        <w:jc w:val="both"/>
+      </w:pPr>
+      <w:r>
+        <w:t xml:space="preserve">Os sistemas com Ile neutro no S1 (XP273 e ACR157) dissociaram em média a ~87 ns, enquanto os sistemas com Asp carregado no S1 (XP352 e QCL936) dissociaram em média a ~137 ns — aumento médio de ~58% no tempo de residência. Esta diferença é mecanisticamente explicada pela ponte salina transitória amidínio⁺↔Asp²⁻ nos sistemas de Asp/S1, que constitui a âncora primária da benzamidina em tripsinas clássicas (Scheidig </w:t>
       </w:r>
       <w:r>
         <w:rPr>
@@ -5426,6 +6382,1652 @@
         <w:t>et al.</w:t>
       </w:r>
       <w:r>
+        <w:t>, 1997). Na ausência desse parceiro aniônico (Ile neutro no S1), o ligante perde a principal interação de ancoragem e dissocia precocemente.</w:t>
+      </w:r>
+    </w:p>
+    <w:p>
+      <w:pPr>
+        <w:jc w:val="both"/>
+      </w:pPr>
+      <w:r>
+        <w:t xml:space="preserve">A correlação entre docking e DM é parcialmente validada: os escores Vina elevados refletem a presença de Asp no S1 (QCL936, 1°) e maior número de contatos docking (XP273, 2°). Contudo, mesmo o sistema de maior afinidade estática (QCL936, −5,733 kcal/mol) não manteve BEN ligada além de 150 ns, demonstrando que a benzamidina carece de capacidade inibitória efetiva nas tripsinas alcalinas de </w:t>
+      </w:r>
+      <w:r>
+        <w:rPr>
+          <w:i/>
+        </w:rPr>
+        <w:t>Spodoptera</w:t>
+      </w:r>
+      <w:r>
+        <w:t>. Este resultado reforça o valor dos peptídeos GORE4 e do inibidor SKTI, que mantiveram ligação estável nos mesmos receptores ao longo de 100 ns completos.</w:t>
+      </w:r>
+    </w:p>
+    <w:p>
+      <w:pPr/>
+    </w:p>
+    <w:p>
+      <w:pPr>
+        <w:pStyle w:val="Heading3"/>
+      </w:pPr>
+      <w:r>
+        <w:t>3.5 Fingerprints de interação molecular — ProLIF</w:t>
+      </w:r>
+    </w:p>
+    <w:p>
+      <w:pPr>
+        <w:jc w:val="both"/>
+      </w:pPr>
+      <w:r>
+        <w:t>A análise de fingerprints ProLIF foi realizada sobre os sete sistemas estáveis para quantificação temporal e tipificação atômica das interações. Os resultados fornecem resolução par-a-par (resíduo ligante × resíduo receptor × tipo de interação), complementando e refinando os mecanismos estabelecidos pelas distâncias mínimas (§3.1–3.2).</w:t>
+      </w:r>
+    </w:p>
+    <w:p>
+      <w:pPr>
+        <w:pStyle w:val="Heading4"/>
+      </w:pPr>
+      <w:r>
+        <w:t>3.5.1 Série GORE4</w:t>
+      </w:r>
+    </w:p>
+    <w:p>
+      <w:pPr>
+        <w:jc w:val="both"/>
+      </w:pPr>
+      <w:r>
+        <w:rPr>
+          <w:b/>
+        </w:rPr>
+        <w:t>QCL936-GORE4</w:t>
+      </w:r>
+      <w:r>
+        <w:t xml:space="preserve"> — O perfil de fingerprint revelou o padrão mais robusto de toda a série GORE4 (Tabela 5). A interação mais persistente foi LYS303-ALA242-Catiônica com </w:t>
+      </w:r>
+      <w:r>
+        <w:rPr>
+          <w:b/>
+        </w:rPr>
+        <w:t>100,0%</w:t>
+      </w:r>
+      <w:r>
+        <w:t xml:space="preserve"> de persistência, acompanhada de LYS303-ALA242-VdW (99,8%) e LYS303-ALA242-HBDonor (95,6%). LYS303 é o resíduo C-terminal do peptídeo GORE4, e ALA242 está localizado na alça imediatamente adjacente a Asp241 (bolsão S1). A interação catiônica de persistência integral entre o grupo ε-amino de LYS303 (+1) e o microambiente aniônico do S1 (Asp241, −1) constitui a âncora eletrostática primária do GORE4 no QCL936 — mecanismo análogo à ponte salina de inibidores clássicos de tripsina, porém com permanência de 100% ao longo dos 100 ns. Resíduos flanqueadores do S1 (TRP263, 84,4%; GLY266, 67,4%) também foram contactados cationicamente por LYS303, indicando que o C-terminal do GORE4 ancora-se na região em redor do S1 de modo extenso. Este dado fornece a explicação atômica direta para a superioridade quantitativa deste complexo (340 ± 41 contatos, 2,75 ± 1,01 H-bonds): a Lys C-terminal cria uma âncora iônica estável no S1 ácido do QCL936, funcionando como mime molecular do resíduo P1=Arg do SKTI neste receptor.</w:t>
+      </w:r>
+    </w:p>
+    <w:p>
+      <w:pPr>
+        <w:jc w:val="both"/>
+      </w:pPr>
+      <w:r>
+        <w:rPr>
+          <w:b/>
+        </w:rPr>
+        <w:t>ACR157-GORE4</w:t>
+      </w:r>
+      <w:r>
+        <w:t xml:space="preserve"> — A interação dominante foi ALA256-GLY228-VdW (55,2%) e ALA256-GLY228-HBDonor (52,6%), revelando que o resíduo ALA256 do GORE4 ancora-se por pontes de hidrogênio e VdW ao GLY228 do receptor — resíduo do backbone localizado na alça S1, adjacente a PHE227. LEU255 (resíduo N-terminal do GORE4) também contacta GLY228 com 28,5% VdW. O par LYS259-HID69-VdW apresentou persistência de apenas 3,1%, confirmando contato catalítico esporádico com a His69 — coerente com as distâncias borderline (&lt;0,5 nm) identificadas na análise convencional. Comparativamente ao QCL936-GORE4, a ausência de interação catiônica persistente no S1 (Ile205 neutro no ACR157) força a ancoragem para interações backbone-a-backbone mais fracas na alça S1, explicando a menor densidade de contatos (256 vs 340) e maior mobilidade do ligante (RMSD lig 0,393 vs 0,229 nm).</w:t>
+      </w:r>
+    </w:p>
+    <w:p>
+      <w:pPr>
+        <w:jc w:val="both"/>
+      </w:pPr>
+      <w:r>
+        <w:rPr>
+          <w:b/>
+        </w:rPr>
+        <w:t>XP273-GORE4</w:t>
+      </w:r>
+      <w:r>
+        <w:t xml:space="preserve"> — O padrão de fingerprint confirma e detalha o mecanismo periférico estabelecido pela análise de distâncias. As interações mais persistentes foram LEU280-TYR89-Catiônica (28,0%) e LEU280-TYR89-VdW (26,6%), seguidas por LEU280-HID86-VdW (20,9%) e LEU280-HID86-Catiônica (17,7%). O resíduo LEU280 do GORE4 ancora-se na região de entrada do sítio ativo, com contatos simultâneos à Tyr89 (periférica) e à HID86 (His catalítica do XP273). A persistência de 17–21% para contatos com HID86 representa contato direto com a His catalítica — dado que a análise de distâncias mínimas havia inferido indiretamente, mas que o ProLIF confirma em nível atômico. A persistência máxima de 28% (em comparação a 100% no QCL936 e 52% no ACR157) é consistente com o modo de inibição periférico e com a ausência de âncora no bolsão S1.</w:t>
+      </w:r>
+    </w:p>
+    <w:p>
+      <w:pPr>
+        <w:jc w:val="both"/>
+      </w:pPr>
+      <w:r>
+        <w:rPr>
+          <w:b/>
+        </w:rPr>
+        <w:t>XP352-GORE4</w:t>
+      </w:r>
+      <w:r>
+        <w:t xml:space="preserve"> — Todas as interações identificadas apresentaram persistências inferiores a 5,1% (LEU315-PRO161-VdW, 5,1%; LEU315-PRO161-Catiônica, 4,8%). O cenário praticamente nulo de interações persistentes confirma inequivocamente a dissociação do complexo, em consonância com RMSD backbone de 0,886 ± 0,440 nm e o colapso de contatos.</w:t>
+      </w:r>
+    </w:p>
+    <w:p>
+      <w:pPr>
+        <w:pStyle w:val="Heading4"/>
+      </w:pPr>
+      <w:r>
+        <w:t>Tabela 5 — Top 5 interações ProLIF mais persistentes (série GORE4)</w:t>
+      </w:r>
+    </w:p>
+    <w:tbl>
+      <w:tblPr>
+        <w:tblStyle w:val="TableGrid"/>
+        <w:tblW w:type="auto" w:w="0"/>
+        <w:tblLook w:firstColumn="1" w:firstRow="1" w:lastColumn="0" w:lastRow="0" w:noHBand="0" w:noVBand="1" w:val="04A0"/>
+      </w:tblPr>
+      <w:tblGrid>
+        <w:gridCol w:w="2280"/>
+        <w:gridCol w:w="2280"/>
+        <w:gridCol w:w="2280"/>
+        <w:gridCol w:w="2280"/>
+      </w:tblGrid>
+      <w:tr>
+        <w:tc>
+          <w:tcPr>
+            <w:tcW w:type="dxa" w:w="2280"/>
+            <w:shd w:val="clear" w:color="auto" w:fill="D9E1F2"/>
+          </w:tcPr>
+          <w:p>
+            <w:r>
+              <w:rPr>
+                <w:rFonts w:ascii="Times New Roman" w:hAnsi="Times New Roman"/>
+                <w:b/>
+                <w:sz w:val="20"/>
+              </w:rPr>
+              <w:t>Sistema</w:t>
+            </w:r>
+          </w:p>
+        </w:tc>
+        <w:tc>
+          <w:tcPr>
+            <w:tcW w:type="dxa" w:w="2280"/>
+            <w:shd w:val="clear" w:color="auto" w:fill="D9E1F2"/>
+          </w:tcPr>
+          <w:p>
+            <w:r>
+              <w:rPr>
+                <w:rFonts w:ascii="Times New Roman" w:hAnsi="Times New Roman"/>
+                <w:b/>
+                <w:sz w:val="20"/>
+              </w:rPr>
+              <w:t>Par interação</w:t>
+            </w:r>
+          </w:p>
+        </w:tc>
+        <w:tc>
+          <w:tcPr>
+            <w:tcW w:type="dxa" w:w="2280"/>
+            <w:shd w:val="clear" w:color="auto" w:fill="D9E1F2"/>
+          </w:tcPr>
+          <w:p>
+            <w:r>
+              <w:rPr>
+                <w:rFonts w:ascii="Times New Roman" w:hAnsi="Times New Roman"/>
+                <w:b/>
+                <w:sz w:val="20"/>
+              </w:rPr>
+              <w:t>Tipo</w:t>
+            </w:r>
+          </w:p>
+        </w:tc>
+        <w:tc>
+          <w:tcPr>
+            <w:tcW w:type="dxa" w:w="2280"/>
+            <w:shd w:val="clear" w:color="auto" w:fill="D9E1F2"/>
+          </w:tcPr>
+          <w:p>
+            <w:r>
+              <w:rPr>
+                <w:rFonts w:ascii="Times New Roman" w:hAnsi="Times New Roman"/>
+                <w:b/>
+                <w:sz w:val="20"/>
+              </w:rPr>
+              <w:t>Persistência (%)</w:t>
+            </w:r>
+          </w:p>
+        </w:tc>
+      </w:tr>
+      <w:tr>
+        <w:tc>
+          <w:tcPr>
+            <w:tcW w:type="dxa" w:w="2280"/>
+          </w:tcPr>
+          <w:p>
+            <w:r>
+              <w:rPr>
+                <w:rFonts w:ascii="Times New Roman" w:hAnsi="Times New Roman"/>
+                <w:sz w:val="20"/>
+              </w:rPr>
+              <w:t>QCL936-GORE4</w:t>
+            </w:r>
+          </w:p>
+        </w:tc>
+        <w:tc>
+          <w:tcPr>
+            <w:tcW w:type="dxa" w:w="2280"/>
+          </w:tcPr>
+          <w:p>
+            <w:r>
+              <w:rPr>
+                <w:rFonts w:ascii="Times New Roman" w:hAnsi="Times New Roman"/>
+                <w:sz w:val="20"/>
+              </w:rPr>
+              <w:t>LYS303-ALA242</w:t>
+            </w:r>
+          </w:p>
+        </w:tc>
+        <w:tc>
+          <w:tcPr>
+            <w:tcW w:type="dxa" w:w="2280"/>
+          </w:tcPr>
+          <w:p>
+            <w:r>
+              <w:rPr>
+                <w:rFonts w:ascii="Times New Roman" w:hAnsi="Times New Roman"/>
+                <w:sz w:val="20"/>
+              </w:rPr>
+              <w:t>Catiônica</w:t>
+            </w:r>
+          </w:p>
+        </w:tc>
+        <w:tc>
+          <w:tcPr>
+            <w:tcW w:type="dxa" w:w="2280"/>
+          </w:tcPr>
+          <w:p>
+            <w:r>
+              <w:rPr>
+                <w:rFonts w:ascii="Times New Roman" w:hAnsi="Times New Roman"/>
+                <w:sz w:val="20"/>
+              </w:rPr>
+              <w:t>100,0</w:t>
+            </w:r>
+          </w:p>
+        </w:tc>
+      </w:tr>
+      <w:tr>
+        <w:tc>
+          <w:tcPr>
+            <w:tcW w:type="dxa" w:w="2280"/>
+          </w:tcPr>
+          <w:p>
+            <w:r>
+              <w:rPr>
+                <w:rFonts w:ascii="Times New Roman" w:hAnsi="Times New Roman"/>
+                <w:sz w:val="20"/>
+              </w:rPr>
+              <w:t>QCL936-GORE4</w:t>
+            </w:r>
+          </w:p>
+        </w:tc>
+        <w:tc>
+          <w:tcPr>
+            <w:tcW w:type="dxa" w:w="2280"/>
+          </w:tcPr>
+          <w:p>
+            <w:r>
+              <w:rPr>
+                <w:rFonts w:ascii="Times New Roman" w:hAnsi="Times New Roman"/>
+                <w:sz w:val="20"/>
+              </w:rPr>
+              <w:t>LYS303-ALA242</w:t>
+            </w:r>
+          </w:p>
+        </w:tc>
+        <w:tc>
+          <w:tcPr>
+            <w:tcW w:type="dxa" w:w="2280"/>
+          </w:tcPr>
+          <w:p>
+            <w:r>
+              <w:rPr>
+                <w:rFonts w:ascii="Times New Roman" w:hAnsi="Times New Roman"/>
+                <w:sz w:val="20"/>
+              </w:rPr>
+              <w:t>VdW</w:t>
+            </w:r>
+          </w:p>
+        </w:tc>
+        <w:tc>
+          <w:tcPr>
+            <w:tcW w:type="dxa" w:w="2280"/>
+          </w:tcPr>
+          <w:p>
+            <w:r>
+              <w:rPr>
+                <w:rFonts w:ascii="Times New Roman" w:hAnsi="Times New Roman"/>
+                <w:sz w:val="20"/>
+              </w:rPr>
+              <w:t>99,8</w:t>
+            </w:r>
+          </w:p>
+        </w:tc>
+      </w:tr>
+      <w:tr>
+        <w:tc>
+          <w:tcPr>
+            <w:tcW w:type="dxa" w:w="2280"/>
+          </w:tcPr>
+          <w:p>
+            <w:r>
+              <w:rPr>
+                <w:rFonts w:ascii="Times New Roman" w:hAnsi="Times New Roman"/>
+                <w:sz w:val="20"/>
+              </w:rPr>
+              <w:t>QCL936-GORE4</w:t>
+            </w:r>
+          </w:p>
+        </w:tc>
+        <w:tc>
+          <w:tcPr>
+            <w:tcW w:type="dxa" w:w="2280"/>
+          </w:tcPr>
+          <w:p>
+            <w:r>
+              <w:rPr>
+                <w:rFonts w:ascii="Times New Roman" w:hAnsi="Times New Roman"/>
+                <w:sz w:val="20"/>
+              </w:rPr>
+              <w:t>LYS303-ALA242</w:t>
+            </w:r>
+          </w:p>
+        </w:tc>
+        <w:tc>
+          <w:tcPr>
+            <w:tcW w:type="dxa" w:w="2280"/>
+          </w:tcPr>
+          <w:p>
+            <w:r>
+              <w:rPr>
+                <w:rFonts w:ascii="Times New Roman" w:hAnsi="Times New Roman"/>
+                <w:sz w:val="20"/>
+              </w:rPr>
+              <w:t>HBDonor</w:t>
+            </w:r>
+          </w:p>
+        </w:tc>
+        <w:tc>
+          <w:tcPr>
+            <w:tcW w:type="dxa" w:w="2280"/>
+          </w:tcPr>
+          <w:p>
+            <w:r>
+              <w:rPr>
+                <w:rFonts w:ascii="Times New Roman" w:hAnsi="Times New Roman"/>
+                <w:sz w:val="20"/>
+              </w:rPr>
+              <w:t>95,6</w:t>
+            </w:r>
+          </w:p>
+        </w:tc>
+      </w:tr>
+      <w:tr>
+        <w:tc>
+          <w:tcPr>
+            <w:tcW w:type="dxa" w:w="2280"/>
+          </w:tcPr>
+          <w:p>
+            <w:r>
+              <w:rPr>
+                <w:rFonts w:ascii="Times New Roman" w:hAnsi="Times New Roman"/>
+                <w:sz w:val="20"/>
+              </w:rPr>
+              <w:t>QCL936-GORE4</w:t>
+            </w:r>
+          </w:p>
+        </w:tc>
+        <w:tc>
+          <w:tcPr>
+            <w:tcW w:type="dxa" w:w="2280"/>
+          </w:tcPr>
+          <w:p>
+            <w:r>
+              <w:rPr>
+                <w:rFonts w:ascii="Times New Roman" w:hAnsi="Times New Roman"/>
+                <w:sz w:val="20"/>
+              </w:rPr>
+              <w:t>LYS303-TRP263</w:t>
+            </w:r>
+          </w:p>
+        </w:tc>
+        <w:tc>
+          <w:tcPr>
+            <w:tcW w:type="dxa" w:w="2280"/>
+          </w:tcPr>
+          <w:p>
+            <w:r>
+              <w:rPr>
+                <w:rFonts w:ascii="Times New Roman" w:hAnsi="Times New Roman"/>
+                <w:sz w:val="20"/>
+              </w:rPr>
+              <w:t>Catiônica</w:t>
+            </w:r>
+          </w:p>
+        </w:tc>
+        <w:tc>
+          <w:tcPr>
+            <w:tcW w:type="dxa" w:w="2280"/>
+          </w:tcPr>
+          <w:p>
+            <w:r>
+              <w:rPr>
+                <w:rFonts w:ascii="Times New Roman" w:hAnsi="Times New Roman"/>
+                <w:sz w:val="20"/>
+              </w:rPr>
+              <w:t>84,4</w:t>
+            </w:r>
+          </w:p>
+        </w:tc>
+      </w:tr>
+      <w:tr>
+        <w:tc>
+          <w:tcPr>
+            <w:tcW w:type="dxa" w:w="2280"/>
+          </w:tcPr>
+          <w:p>
+            <w:r>
+              <w:rPr>
+                <w:rFonts w:ascii="Times New Roman" w:hAnsi="Times New Roman"/>
+                <w:sz w:val="20"/>
+              </w:rPr>
+              <w:t>QCL936-GORE4</w:t>
+            </w:r>
+          </w:p>
+        </w:tc>
+        <w:tc>
+          <w:tcPr>
+            <w:tcW w:type="dxa" w:w="2280"/>
+          </w:tcPr>
+          <w:p>
+            <w:r>
+              <w:rPr>
+                <w:rFonts w:ascii="Times New Roman" w:hAnsi="Times New Roman"/>
+                <w:sz w:val="20"/>
+              </w:rPr>
+              <w:t>LYS303-GLY266</w:t>
+            </w:r>
+          </w:p>
+        </w:tc>
+        <w:tc>
+          <w:tcPr>
+            <w:tcW w:type="dxa" w:w="2280"/>
+          </w:tcPr>
+          <w:p>
+            <w:r>
+              <w:rPr>
+                <w:rFonts w:ascii="Times New Roman" w:hAnsi="Times New Roman"/>
+                <w:sz w:val="20"/>
+              </w:rPr>
+              <w:t>Catiônica</w:t>
+            </w:r>
+          </w:p>
+        </w:tc>
+        <w:tc>
+          <w:tcPr>
+            <w:tcW w:type="dxa" w:w="2280"/>
+          </w:tcPr>
+          <w:p>
+            <w:r>
+              <w:rPr>
+                <w:rFonts w:ascii="Times New Roman" w:hAnsi="Times New Roman"/>
+                <w:sz w:val="20"/>
+              </w:rPr>
+              <w:t>67,4</w:t>
+            </w:r>
+          </w:p>
+        </w:tc>
+      </w:tr>
+      <w:tr>
+        <w:tc>
+          <w:tcPr>
+            <w:tcW w:type="dxa" w:w="2280"/>
+          </w:tcPr>
+          <w:p>
+            <w:r>
+              <w:rPr>
+                <w:rFonts w:ascii="Times New Roman" w:hAnsi="Times New Roman"/>
+                <w:sz w:val="20"/>
+              </w:rPr>
+              <w:t>ACR157-GORE4</w:t>
+            </w:r>
+          </w:p>
+        </w:tc>
+        <w:tc>
+          <w:tcPr>
+            <w:tcW w:type="dxa" w:w="2280"/>
+          </w:tcPr>
+          <w:p>
+            <w:r>
+              <w:rPr>
+                <w:rFonts w:ascii="Times New Roman" w:hAnsi="Times New Roman"/>
+                <w:sz w:val="20"/>
+              </w:rPr>
+              <w:t>ALA256-GLY228</w:t>
+            </w:r>
+          </w:p>
+        </w:tc>
+        <w:tc>
+          <w:tcPr>
+            <w:tcW w:type="dxa" w:w="2280"/>
+          </w:tcPr>
+          <w:p>
+            <w:r>
+              <w:rPr>
+                <w:rFonts w:ascii="Times New Roman" w:hAnsi="Times New Roman"/>
+                <w:sz w:val="20"/>
+              </w:rPr>
+              <w:t>VdW</w:t>
+            </w:r>
+          </w:p>
+        </w:tc>
+        <w:tc>
+          <w:tcPr>
+            <w:tcW w:type="dxa" w:w="2280"/>
+          </w:tcPr>
+          <w:p>
+            <w:r>
+              <w:rPr>
+                <w:rFonts w:ascii="Times New Roman" w:hAnsi="Times New Roman"/>
+                <w:sz w:val="20"/>
+              </w:rPr>
+              <w:t>55,2</w:t>
+            </w:r>
+          </w:p>
+        </w:tc>
+      </w:tr>
+      <w:tr>
+        <w:tc>
+          <w:tcPr>
+            <w:tcW w:type="dxa" w:w="2280"/>
+          </w:tcPr>
+          <w:p>
+            <w:r>
+              <w:rPr>
+                <w:rFonts w:ascii="Times New Roman" w:hAnsi="Times New Roman"/>
+                <w:sz w:val="20"/>
+              </w:rPr>
+              <w:t>ACR157-GORE4</w:t>
+            </w:r>
+          </w:p>
+        </w:tc>
+        <w:tc>
+          <w:tcPr>
+            <w:tcW w:type="dxa" w:w="2280"/>
+          </w:tcPr>
+          <w:p>
+            <w:r>
+              <w:rPr>
+                <w:rFonts w:ascii="Times New Roman" w:hAnsi="Times New Roman"/>
+                <w:sz w:val="20"/>
+              </w:rPr>
+              <w:t>ALA256-GLY228</w:t>
+            </w:r>
+          </w:p>
+        </w:tc>
+        <w:tc>
+          <w:tcPr>
+            <w:tcW w:type="dxa" w:w="2280"/>
+          </w:tcPr>
+          <w:p>
+            <w:r>
+              <w:rPr>
+                <w:rFonts w:ascii="Times New Roman" w:hAnsi="Times New Roman"/>
+                <w:sz w:val="20"/>
+              </w:rPr>
+              <w:t>HBDonor</w:t>
+            </w:r>
+          </w:p>
+        </w:tc>
+        <w:tc>
+          <w:tcPr>
+            <w:tcW w:type="dxa" w:w="2280"/>
+          </w:tcPr>
+          <w:p>
+            <w:r>
+              <w:rPr>
+                <w:rFonts w:ascii="Times New Roman" w:hAnsi="Times New Roman"/>
+                <w:sz w:val="20"/>
+              </w:rPr>
+              <w:t>52,6</w:t>
+            </w:r>
+          </w:p>
+        </w:tc>
+      </w:tr>
+      <w:tr>
+        <w:tc>
+          <w:tcPr>
+            <w:tcW w:type="dxa" w:w="2280"/>
+          </w:tcPr>
+          <w:p>
+            <w:r>
+              <w:rPr>
+                <w:rFonts w:ascii="Times New Roman" w:hAnsi="Times New Roman"/>
+                <w:sz w:val="20"/>
+              </w:rPr>
+              <w:t>ACR157-GORE4</w:t>
+            </w:r>
+          </w:p>
+        </w:tc>
+        <w:tc>
+          <w:tcPr>
+            <w:tcW w:type="dxa" w:w="2280"/>
+          </w:tcPr>
+          <w:p>
+            <w:r>
+              <w:rPr>
+                <w:rFonts w:ascii="Times New Roman" w:hAnsi="Times New Roman"/>
+                <w:sz w:val="20"/>
+              </w:rPr>
+              <w:t>LEU255-GLY228</w:t>
+            </w:r>
+          </w:p>
+        </w:tc>
+        <w:tc>
+          <w:tcPr>
+            <w:tcW w:type="dxa" w:w="2280"/>
+          </w:tcPr>
+          <w:p>
+            <w:r>
+              <w:rPr>
+                <w:rFonts w:ascii="Times New Roman" w:hAnsi="Times New Roman"/>
+                <w:sz w:val="20"/>
+              </w:rPr>
+              <w:t>VdW</w:t>
+            </w:r>
+          </w:p>
+        </w:tc>
+        <w:tc>
+          <w:tcPr>
+            <w:tcW w:type="dxa" w:w="2280"/>
+          </w:tcPr>
+          <w:p>
+            <w:r>
+              <w:rPr>
+                <w:rFonts w:ascii="Times New Roman" w:hAnsi="Times New Roman"/>
+                <w:sz w:val="20"/>
+              </w:rPr>
+              <w:t>28,5</w:t>
+            </w:r>
+          </w:p>
+        </w:tc>
+      </w:tr>
+      <w:tr>
+        <w:tc>
+          <w:tcPr>
+            <w:tcW w:type="dxa" w:w="2280"/>
+          </w:tcPr>
+          <w:p>
+            <w:r>
+              <w:rPr>
+                <w:rFonts w:ascii="Times New Roman" w:hAnsi="Times New Roman"/>
+                <w:sz w:val="20"/>
+              </w:rPr>
+              <w:t>XP273-GORE4</w:t>
+            </w:r>
+          </w:p>
+        </w:tc>
+        <w:tc>
+          <w:tcPr>
+            <w:tcW w:type="dxa" w:w="2280"/>
+          </w:tcPr>
+          <w:p>
+            <w:r>
+              <w:rPr>
+                <w:rFonts w:ascii="Times New Roman" w:hAnsi="Times New Roman"/>
+                <w:sz w:val="20"/>
+              </w:rPr>
+              <w:t>LEU280-TYR89</w:t>
+            </w:r>
+          </w:p>
+        </w:tc>
+        <w:tc>
+          <w:tcPr>
+            <w:tcW w:type="dxa" w:w="2280"/>
+          </w:tcPr>
+          <w:p>
+            <w:r>
+              <w:rPr>
+                <w:rFonts w:ascii="Times New Roman" w:hAnsi="Times New Roman"/>
+                <w:sz w:val="20"/>
+              </w:rPr>
+              <w:t>Catiônica</w:t>
+            </w:r>
+          </w:p>
+        </w:tc>
+        <w:tc>
+          <w:tcPr>
+            <w:tcW w:type="dxa" w:w="2280"/>
+          </w:tcPr>
+          <w:p>
+            <w:r>
+              <w:rPr>
+                <w:rFonts w:ascii="Times New Roman" w:hAnsi="Times New Roman"/>
+                <w:sz w:val="20"/>
+              </w:rPr>
+              <w:t>28,0</w:t>
+            </w:r>
+          </w:p>
+        </w:tc>
+      </w:tr>
+      <w:tr>
+        <w:tc>
+          <w:tcPr>
+            <w:tcW w:type="dxa" w:w="2280"/>
+          </w:tcPr>
+          <w:p>
+            <w:r>
+              <w:rPr>
+                <w:rFonts w:ascii="Times New Roman" w:hAnsi="Times New Roman"/>
+                <w:sz w:val="20"/>
+              </w:rPr>
+              <w:t>XP273-GORE4</w:t>
+            </w:r>
+          </w:p>
+        </w:tc>
+        <w:tc>
+          <w:tcPr>
+            <w:tcW w:type="dxa" w:w="2280"/>
+          </w:tcPr>
+          <w:p>
+            <w:r>
+              <w:rPr>
+                <w:rFonts w:ascii="Times New Roman" w:hAnsi="Times New Roman"/>
+                <w:sz w:val="20"/>
+              </w:rPr>
+              <w:t>LEU280-HID86</w:t>
+            </w:r>
+          </w:p>
+        </w:tc>
+        <w:tc>
+          <w:tcPr>
+            <w:tcW w:type="dxa" w:w="2280"/>
+          </w:tcPr>
+          <w:p>
+            <w:r>
+              <w:rPr>
+                <w:rFonts w:ascii="Times New Roman" w:hAnsi="Times New Roman"/>
+                <w:sz w:val="20"/>
+              </w:rPr>
+              <w:t>VdW</w:t>
+            </w:r>
+          </w:p>
+        </w:tc>
+        <w:tc>
+          <w:tcPr>
+            <w:tcW w:type="dxa" w:w="2280"/>
+          </w:tcPr>
+          <w:p>
+            <w:r>
+              <w:rPr>
+                <w:rFonts w:ascii="Times New Roman" w:hAnsi="Times New Roman"/>
+                <w:sz w:val="20"/>
+              </w:rPr>
+              <w:t>20,9</w:t>
+            </w:r>
+          </w:p>
+        </w:tc>
+      </w:tr>
+    </w:tbl>
+    <w:p>
+      <w:pPr/>
+    </w:p>
+    <w:p>
+      <w:pPr>
+        <w:pStyle w:val="Heading4"/>
+      </w:pPr>
+      <w:r>
+        <w:t>3.5.2 Série SKTI</w:t>
+      </w:r>
+    </w:p>
+    <w:p>
+      <w:pPr>
+        <w:jc w:val="both"/>
+      </w:pPr>
+      <w:r>
+        <w:rPr>
+          <w:b/>
+        </w:rPr>
+        <w:t>ACR157-SKTI</w:t>
+      </w:r>
+      <w:r>
+        <w:t xml:space="preserve"> — O fingerprint revelou o perfil de maior persistência e diversidade de interações entre todos os sistemas analisados. ARG317-GLN206-Catiônica (100,0%) e ARG317-SER226-VdW (99,9%) + HBDonor (99,8%) foram as interações mais persistentes. ARG317 é o resíduo P1 da alça reativa SPYRIRF do SKTI, e GLN206 localiza-se na alça adjacente ao Ile205 (S1). SER226 corresponde à posição P1' do bolsão S1. Adicionalmente, ARG317-GLY230-Catiônica (99,8%) e ARG317-PHE227-Catiônica (98,2%) confirmam engajamento simultâneo de múltiplos resíduos do bolsão S1 pelo P1=Arg. A interação secundária ASP255-GLY73-Catiônica (93,3%) reflete ancoragem adicional fora do loop reativo. A persistência de 100% para ARG317-GLN206 ao longo de 1001 frames analisados confirma que o posicionamento canônico P1=Arg↔S1 é mantido sem interrupção durante toda a trajetória — hallmark do mecanismo Kunitz canônico completo (Krowarsch </w:t>
+      </w:r>
+      <w:r>
+        <w:rPr>
+          <w:i/>
+        </w:rPr>
+        <w:t>et al.</w:t>
+      </w:r>
+      <w:r>
+        <w:t>, 2003).</w:t>
+      </w:r>
+    </w:p>
+    <w:p>
+      <w:pPr>
+        <w:jc w:val="both"/>
+      </w:pPr>
+      <w:r>
+        <w:rPr>
+          <w:b/>
+        </w:rPr>
+        <w:t>QCL936-SKTI</w:t>
+      </w:r>
+      <w:r>
+        <w:t xml:space="preserve"> — Dois resíduos ARG do SKTI (ARG361 e ARG363) dominam o fingerprint. ARG361-GLY266-Catiônica (100,0%), ARG361-ALA242-Catiônica (100,0%) e ARG361-GLY266-HBDonor (95,9%) confirmam ancoragem bilateral de ARG361 na região S1 do QCL936 (Asp241/ALA242 e GLY266). ARG363-PHE75-Catiônica (97,6%) e ARG363-PHE75-HBDonor (90,2%) revelam um segundo ponto de ancoragem envolvendo PHE75 — resíduo do bolsão S1 hidrofóbico do QCL936 adjacente a Asp241. A arquitetura bipartite (ARG361 + ARG363, cada um com persistência ≥ 97,6%) reflete o posicionamento dos dois resíduos positivos que flanqueiam o P1=Arg central da alça SPYRIRF, e explica a robustez da interface QCL936-SKTI (720 ± 77 contatos, 10,4 ± 2,0 H-bonds) apesar da ausência de contato com Asp142.</w:t>
+      </w:r>
+    </w:p>
+    <w:p>
+      <w:pPr>
+        <w:jc w:val="both"/>
+      </w:pPr>
+      <w:r>
+        <w:rPr>
+          <w:b/>
+        </w:rPr>
+        <w:t>XP273-SKTI</w:t>
+      </w:r>
+      <w:r>
+        <w:t xml:space="preserve"> — ARG342-ILE67-Catiônica (94,1%), ARG342-ILE67-VdW (90,3%) e ARG342-ILE67-HBDonor (83,8%) indicam que ARG342 ancora o P1=Arg no bolsão S1 do XP273 (ILE67 adjacente a ILE229/S1). ARG342-PHE66-Catiônica (78,4%) confirma engajamento adicional no bolsão hidrofóbico. De especial relevância mecanística é a interação </w:t>
+      </w:r>
+      <w:r>
+        <w:rPr>
+          <w:b/>
+        </w:rPr>
+        <w:t>ARG344-HID86-VdW (58,4%)</w:t>
+      </w:r>
+      <w:r>
+        <w:t xml:space="preserve"> e ARG344-HID86-Catiônica (36,7%): ARG344 do SKTI contacta diretamente HID86 (His catalítica do XP273), dado não capturado pela análise de distâncias que monitorava Tyr83 (triad_1). Esta observação reposiciona parcialmente o modo de inibição XP273-SKTI — o SKTI alcança a His catalítica em 58% dos frames, aproximando este complexo do modo Kunitz com engajamento His, adicionalmente ao bloqueio Tyr83+Asp132+S1 identificado anteriormente.</w:t>
+      </w:r>
+    </w:p>
+    <w:p>
+      <w:pPr>
+        <w:pStyle w:val="Heading4"/>
+      </w:pPr>
+      <w:r>
+        <w:t>Tabela 6 — Top 5 interações ProLIF mais persistentes (série SKTI)</w:t>
+      </w:r>
+    </w:p>
+    <w:tbl>
+      <w:tblPr>
+        <w:tblStyle w:val="TableGrid"/>
+        <w:tblW w:type="auto" w:w="0"/>
+        <w:tblLook w:firstColumn="1" w:firstRow="1" w:lastColumn="0" w:lastRow="0" w:noHBand="0" w:noVBand="1" w:val="04A0"/>
+      </w:tblPr>
+      <w:tblGrid>
+        <w:gridCol w:w="2280"/>
+        <w:gridCol w:w="2280"/>
+        <w:gridCol w:w="2280"/>
+        <w:gridCol w:w="2280"/>
+      </w:tblGrid>
+      <w:tr>
+        <w:tc>
+          <w:tcPr>
+            <w:tcW w:type="dxa" w:w="2280"/>
+            <w:shd w:val="clear" w:color="auto" w:fill="D9E1F2"/>
+          </w:tcPr>
+          <w:p>
+            <w:r>
+              <w:rPr>
+                <w:rFonts w:ascii="Times New Roman" w:hAnsi="Times New Roman"/>
+                <w:b/>
+                <w:sz w:val="20"/>
+              </w:rPr>
+              <w:t>Sistema</w:t>
+            </w:r>
+          </w:p>
+        </w:tc>
+        <w:tc>
+          <w:tcPr>
+            <w:tcW w:type="dxa" w:w="2280"/>
+            <w:shd w:val="clear" w:color="auto" w:fill="D9E1F2"/>
+          </w:tcPr>
+          <w:p>
+            <w:r>
+              <w:rPr>
+                <w:rFonts w:ascii="Times New Roman" w:hAnsi="Times New Roman"/>
+                <w:b/>
+                <w:sz w:val="20"/>
+              </w:rPr>
+              <w:t>Par interação</w:t>
+            </w:r>
+          </w:p>
+        </w:tc>
+        <w:tc>
+          <w:tcPr>
+            <w:tcW w:type="dxa" w:w="2280"/>
+            <w:shd w:val="clear" w:color="auto" w:fill="D9E1F2"/>
+          </w:tcPr>
+          <w:p>
+            <w:r>
+              <w:rPr>
+                <w:rFonts w:ascii="Times New Roman" w:hAnsi="Times New Roman"/>
+                <w:b/>
+                <w:sz w:val="20"/>
+              </w:rPr>
+              <w:t>Tipo</w:t>
+            </w:r>
+          </w:p>
+        </w:tc>
+        <w:tc>
+          <w:tcPr>
+            <w:tcW w:type="dxa" w:w="2280"/>
+            <w:shd w:val="clear" w:color="auto" w:fill="D9E1F2"/>
+          </w:tcPr>
+          <w:p>
+            <w:r>
+              <w:rPr>
+                <w:rFonts w:ascii="Times New Roman" w:hAnsi="Times New Roman"/>
+                <w:b/>
+                <w:sz w:val="20"/>
+              </w:rPr>
+              <w:t>Persistência (%)</w:t>
+            </w:r>
+          </w:p>
+        </w:tc>
+      </w:tr>
+      <w:tr>
+        <w:tc>
+          <w:tcPr>
+            <w:tcW w:type="dxa" w:w="2280"/>
+          </w:tcPr>
+          <w:p>
+            <w:r>
+              <w:rPr>
+                <w:rFonts w:ascii="Times New Roman" w:hAnsi="Times New Roman"/>
+                <w:sz w:val="20"/>
+              </w:rPr>
+              <w:t>ACR157-SKTI</w:t>
+            </w:r>
+          </w:p>
+        </w:tc>
+        <w:tc>
+          <w:tcPr>
+            <w:tcW w:type="dxa" w:w="2280"/>
+          </w:tcPr>
+          <w:p>
+            <w:r>
+              <w:rPr>
+                <w:rFonts w:ascii="Times New Roman" w:hAnsi="Times New Roman"/>
+                <w:sz w:val="20"/>
+              </w:rPr>
+              <w:t>ARG317-GLN206</w:t>
+            </w:r>
+          </w:p>
+        </w:tc>
+        <w:tc>
+          <w:tcPr>
+            <w:tcW w:type="dxa" w:w="2280"/>
+          </w:tcPr>
+          <w:p>
+            <w:r>
+              <w:rPr>
+                <w:rFonts w:ascii="Times New Roman" w:hAnsi="Times New Roman"/>
+                <w:sz w:val="20"/>
+              </w:rPr>
+              <w:t>Catiônica</w:t>
+            </w:r>
+          </w:p>
+        </w:tc>
+        <w:tc>
+          <w:tcPr>
+            <w:tcW w:type="dxa" w:w="2280"/>
+          </w:tcPr>
+          <w:p>
+            <w:r>
+              <w:rPr>
+                <w:rFonts w:ascii="Times New Roman" w:hAnsi="Times New Roman"/>
+                <w:sz w:val="20"/>
+              </w:rPr>
+              <w:t>100,0</w:t>
+            </w:r>
+          </w:p>
+        </w:tc>
+      </w:tr>
+      <w:tr>
+        <w:tc>
+          <w:tcPr>
+            <w:tcW w:type="dxa" w:w="2280"/>
+          </w:tcPr>
+          <w:p>
+            <w:r>
+              <w:rPr>
+                <w:rFonts w:ascii="Times New Roman" w:hAnsi="Times New Roman"/>
+                <w:sz w:val="20"/>
+              </w:rPr>
+              <w:t>ACR157-SKTI</w:t>
+            </w:r>
+          </w:p>
+        </w:tc>
+        <w:tc>
+          <w:tcPr>
+            <w:tcW w:type="dxa" w:w="2280"/>
+          </w:tcPr>
+          <w:p>
+            <w:r>
+              <w:rPr>
+                <w:rFonts w:ascii="Times New Roman" w:hAnsi="Times New Roman"/>
+                <w:sz w:val="20"/>
+              </w:rPr>
+              <w:t>ARG317-SER226</w:t>
+            </w:r>
+          </w:p>
+        </w:tc>
+        <w:tc>
+          <w:tcPr>
+            <w:tcW w:type="dxa" w:w="2280"/>
+          </w:tcPr>
+          <w:p>
+            <w:r>
+              <w:rPr>
+                <w:rFonts w:ascii="Times New Roman" w:hAnsi="Times New Roman"/>
+                <w:sz w:val="20"/>
+              </w:rPr>
+              <w:t>VdW</w:t>
+            </w:r>
+          </w:p>
+        </w:tc>
+        <w:tc>
+          <w:tcPr>
+            <w:tcW w:type="dxa" w:w="2280"/>
+          </w:tcPr>
+          <w:p>
+            <w:r>
+              <w:rPr>
+                <w:rFonts w:ascii="Times New Roman" w:hAnsi="Times New Roman"/>
+                <w:sz w:val="20"/>
+              </w:rPr>
+              <w:t>99,9</w:t>
+            </w:r>
+          </w:p>
+        </w:tc>
+      </w:tr>
+      <w:tr>
+        <w:tc>
+          <w:tcPr>
+            <w:tcW w:type="dxa" w:w="2280"/>
+          </w:tcPr>
+          <w:p>
+            <w:r>
+              <w:rPr>
+                <w:rFonts w:ascii="Times New Roman" w:hAnsi="Times New Roman"/>
+                <w:sz w:val="20"/>
+              </w:rPr>
+              <w:t>ACR157-SKTI</w:t>
+            </w:r>
+          </w:p>
+        </w:tc>
+        <w:tc>
+          <w:tcPr>
+            <w:tcW w:type="dxa" w:w="2280"/>
+          </w:tcPr>
+          <w:p>
+            <w:r>
+              <w:rPr>
+                <w:rFonts w:ascii="Times New Roman" w:hAnsi="Times New Roman"/>
+                <w:sz w:val="20"/>
+              </w:rPr>
+              <w:t>ARG317-SER226</w:t>
+            </w:r>
+          </w:p>
+        </w:tc>
+        <w:tc>
+          <w:tcPr>
+            <w:tcW w:type="dxa" w:w="2280"/>
+          </w:tcPr>
+          <w:p>
+            <w:r>
+              <w:rPr>
+                <w:rFonts w:ascii="Times New Roman" w:hAnsi="Times New Roman"/>
+                <w:sz w:val="20"/>
+              </w:rPr>
+              <w:t>HBDonor</w:t>
+            </w:r>
+          </w:p>
+        </w:tc>
+        <w:tc>
+          <w:tcPr>
+            <w:tcW w:type="dxa" w:w="2280"/>
+          </w:tcPr>
+          <w:p>
+            <w:r>
+              <w:rPr>
+                <w:rFonts w:ascii="Times New Roman" w:hAnsi="Times New Roman"/>
+                <w:sz w:val="20"/>
+              </w:rPr>
+              <w:t>99,8</w:t>
+            </w:r>
+          </w:p>
+        </w:tc>
+      </w:tr>
+      <w:tr>
+        <w:tc>
+          <w:tcPr>
+            <w:tcW w:type="dxa" w:w="2280"/>
+          </w:tcPr>
+          <w:p>
+            <w:r>
+              <w:rPr>
+                <w:rFonts w:ascii="Times New Roman" w:hAnsi="Times New Roman"/>
+                <w:sz w:val="20"/>
+              </w:rPr>
+              <w:t>ACR157-SKTI</w:t>
+            </w:r>
+          </w:p>
+        </w:tc>
+        <w:tc>
+          <w:tcPr>
+            <w:tcW w:type="dxa" w:w="2280"/>
+          </w:tcPr>
+          <w:p>
+            <w:r>
+              <w:rPr>
+                <w:rFonts w:ascii="Times New Roman" w:hAnsi="Times New Roman"/>
+                <w:sz w:val="20"/>
+              </w:rPr>
+              <w:t>ARG317-GLY230</w:t>
+            </w:r>
+          </w:p>
+        </w:tc>
+        <w:tc>
+          <w:tcPr>
+            <w:tcW w:type="dxa" w:w="2280"/>
+          </w:tcPr>
+          <w:p>
+            <w:r>
+              <w:rPr>
+                <w:rFonts w:ascii="Times New Roman" w:hAnsi="Times New Roman"/>
+                <w:sz w:val="20"/>
+              </w:rPr>
+              <w:t>Catiônica</w:t>
+            </w:r>
+          </w:p>
+        </w:tc>
+        <w:tc>
+          <w:tcPr>
+            <w:tcW w:type="dxa" w:w="2280"/>
+          </w:tcPr>
+          <w:p>
+            <w:r>
+              <w:rPr>
+                <w:rFonts w:ascii="Times New Roman" w:hAnsi="Times New Roman"/>
+                <w:sz w:val="20"/>
+              </w:rPr>
+              <w:t>99,8</w:t>
+            </w:r>
+          </w:p>
+        </w:tc>
+      </w:tr>
+      <w:tr>
+        <w:tc>
+          <w:tcPr>
+            <w:tcW w:type="dxa" w:w="2280"/>
+          </w:tcPr>
+          <w:p>
+            <w:r>
+              <w:rPr>
+                <w:rFonts w:ascii="Times New Roman" w:hAnsi="Times New Roman"/>
+                <w:sz w:val="20"/>
+              </w:rPr>
+              <w:t>ACR157-SKTI</w:t>
+            </w:r>
+          </w:p>
+        </w:tc>
+        <w:tc>
+          <w:tcPr>
+            <w:tcW w:type="dxa" w:w="2280"/>
+          </w:tcPr>
+          <w:p>
+            <w:r>
+              <w:rPr>
+                <w:rFonts w:ascii="Times New Roman" w:hAnsi="Times New Roman"/>
+                <w:sz w:val="20"/>
+              </w:rPr>
+              <w:t>ARG317-PHE227</w:t>
+            </w:r>
+          </w:p>
+        </w:tc>
+        <w:tc>
+          <w:tcPr>
+            <w:tcW w:type="dxa" w:w="2280"/>
+          </w:tcPr>
+          <w:p>
+            <w:r>
+              <w:rPr>
+                <w:rFonts w:ascii="Times New Roman" w:hAnsi="Times New Roman"/>
+                <w:sz w:val="20"/>
+              </w:rPr>
+              <w:t>Catiônica</w:t>
+            </w:r>
+          </w:p>
+        </w:tc>
+        <w:tc>
+          <w:tcPr>
+            <w:tcW w:type="dxa" w:w="2280"/>
+          </w:tcPr>
+          <w:p>
+            <w:r>
+              <w:rPr>
+                <w:rFonts w:ascii="Times New Roman" w:hAnsi="Times New Roman"/>
+                <w:sz w:val="20"/>
+              </w:rPr>
+              <w:t>98,2</w:t>
+            </w:r>
+          </w:p>
+        </w:tc>
+      </w:tr>
+      <w:tr>
+        <w:tc>
+          <w:tcPr>
+            <w:tcW w:type="dxa" w:w="2280"/>
+          </w:tcPr>
+          <w:p>
+            <w:r>
+              <w:rPr>
+                <w:rFonts w:ascii="Times New Roman" w:hAnsi="Times New Roman"/>
+                <w:sz w:val="20"/>
+              </w:rPr>
+              <w:t>QCL936-SKTI</w:t>
+            </w:r>
+          </w:p>
+        </w:tc>
+        <w:tc>
+          <w:tcPr>
+            <w:tcW w:type="dxa" w:w="2280"/>
+          </w:tcPr>
+          <w:p>
+            <w:r>
+              <w:rPr>
+                <w:rFonts w:ascii="Times New Roman" w:hAnsi="Times New Roman"/>
+                <w:sz w:val="20"/>
+              </w:rPr>
+              <w:t>ARG361-GLY266</w:t>
+            </w:r>
+          </w:p>
+        </w:tc>
+        <w:tc>
+          <w:tcPr>
+            <w:tcW w:type="dxa" w:w="2280"/>
+          </w:tcPr>
+          <w:p>
+            <w:r>
+              <w:rPr>
+                <w:rFonts w:ascii="Times New Roman" w:hAnsi="Times New Roman"/>
+                <w:sz w:val="20"/>
+              </w:rPr>
+              <w:t>Catiônica</w:t>
+            </w:r>
+          </w:p>
+        </w:tc>
+        <w:tc>
+          <w:tcPr>
+            <w:tcW w:type="dxa" w:w="2280"/>
+          </w:tcPr>
+          <w:p>
+            <w:r>
+              <w:rPr>
+                <w:rFonts w:ascii="Times New Roman" w:hAnsi="Times New Roman"/>
+                <w:sz w:val="20"/>
+              </w:rPr>
+              <w:t>100,0</w:t>
+            </w:r>
+          </w:p>
+        </w:tc>
+      </w:tr>
+      <w:tr>
+        <w:tc>
+          <w:tcPr>
+            <w:tcW w:type="dxa" w:w="2280"/>
+          </w:tcPr>
+          <w:p>
+            <w:r>
+              <w:rPr>
+                <w:rFonts w:ascii="Times New Roman" w:hAnsi="Times New Roman"/>
+                <w:sz w:val="20"/>
+              </w:rPr>
+              <w:t>QCL936-SKTI</w:t>
+            </w:r>
+          </w:p>
+        </w:tc>
+        <w:tc>
+          <w:tcPr>
+            <w:tcW w:type="dxa" w:w="2280"/>
+          </w:tcPr>
+          <w:p>
+            <w:r>
+              <w:rPr>
+                <w:rFonts w:ascii="Times New Roman" w:hAnsi="Times New Roman"/>
+                <w:sz w:val="20"/>
+              </w:rPr>
+              <w:t>ARG361-ALA242</w:t>
+            </w:r>
+          </w:p>
+        </w:tc>
+        <w:tc>
+          <w:tcPr>
+            <w:tcW w:type="dxa" w:w="2280"/>
+          </w:tcPr>
+          <w:p>
+            <w:r>
+              <w:rPr>
+                <w:rFonts w:ascii="Times New Roman" w:hAnsi="Times New Roman"/>
+                <w:sz w:val="20"/>
+              </w:rPr>
+              <w:t>Catiônica</w:t>
+            </w:r>
+          </w:p>
+        </w:tc>
+        <w:tc>
+          <w:tcPr>
+            <w:tcW w:type="dxa" w:w="2280"/>
+          </w:tcPr>
+          <w:p>
+            <w:r>
+              <w:rPr>
+                <w:rFonts w:ascii="Times New Roman" w:hAnsi="Times New Roman"/>
+                <w:sz w:val="20"/>
+              </w:rPr>
+              <w:t>100,0</w:t>
+            </w:r>
+          </w:p>
+        </w:tc>
+      </w:tr>
+      <w:tr>
+        <w:tc>
+          <w:tcPr>
+            <w:tcW w:type="dxa" w:w="2280"/>
+          </w:tcPr>
+          <w:p>
+            <w:r>
+              <w:rPr>
+                <w:rFonts w:ascii="Times New Roman" w:hAnsi="Times New Roman"/>
+                <w:sz w:val="20"/>
+              </w:rPr>
+              <w:t>QCL936-SKTI</w:t>
+            </w:r>
+          </w:p>
+        </w:tc>
+        <w:tc>
+          <w:tcPr>
+            <w:tcW w:type="dxa" w:w="2280"/>
+          </w:tcPr>
+          <w:p>
+            <w:r>
+              <w:rPr>
+                <w:rFonts w:ascii="Times New Roman" w:hAnsi="Times New Roman"/>
+                <w:sz w:val="20"/>
+              </w:rPr>
+              <w:t>ARG363-PHE75</w:t>
+            </w:r>
+          </w:p>
+        </w:tc>
+        <w:tc>
+          <w:tcPr>
+            <w:tcW w:type="dxa" w:w="2280"/>
+          </w:tcPr>
+          <w:p>
+            <w:r>
+              <w:rPr>
+                <w:rFonts w:ascii="Times New Roman" w:hAnsi="Times New Roman"/>
+                <w:sz w:val="20"/>
+              </w:rPr>
+              <w:t>Catiônica</w:t>
+            </w:r>
+          </w:p>
+        </w:tc>
+        <w:tc>
+          <w:tcPr>
+            <w:tcW w:type="dxa" w:w="2280"/>
+          </w:tcPr>
+          <w:p>
+            <w:r>
+              <w:rPr>
+                <w:rFonts w:ascii="Times New Roman" w:hAnsi="Times New Roman"/>
+                <w:sz w:val="20"/>
+              </w:rPr>
+              <w:t>97,6</w:t>
+            </w:r>
+          </w:p>
+        </w:tc>
+      </w:tr>
+      <w:tr>
+        <w:tc>
+          <w:tcPr>
+            <w:tcW w:type="dxa" w:w="2280"/>
+          </w:tcPr>
+          <w:p>
+            <w:r>
+              <w:rPr>
+                <w:rFonts w:ascii="Times New Roman" w:hAnsi="Times New Roman"/>
+                <w:sz w:val="20"/>
+              </w:rPr>
+              <w:t>XP273-SKTI</w:t>
+            </w:r>
+          </w:p>
+        </w:tc>
+        <w:tc>
+          <w:tcPr>
+            <w:tcW w:type="dxa" w:w="2280"/>
+          </w:tcPr>
+          <w:p>
+            <w:r>
+              <w:rPr>
+                <w:rFonts w:ascii="Times New Roman" w:hAnsi="Times New Roman"/>
+                <w:sz w:val="20"/>
+              </w:rPr>
+              <w:t>ARG342-ILE67</w:t>
+            </w:r>
+          </w:p>
+        </w:tc>
+        <w:tc>
+          <w:tcPr>
+            <w:tcW w:type="dxa" w:w="2280"/>
+          </w:tcPr>
+          <w:p>
+            <w:r>
+              <w:rPr>
+                <w:rFonts w:ascii="Times New Roman" w:hAnsi="Times New Roman"/>
+                <w:sz w:val="20"/>
+              </w:rPr>
+              <w:t>Catiônica</w:t>
+            </w:r>
+          </w:p>
+        </w:tc>
+        <w:tc>
+          <w:tcPr>
+            <w:tcW w:type="dxa" w:w="2280"/>
+          </w:tcPr>
+          <w:p>
+            <w:r>
+              <w:rPr>
+                <w:rFonts w:ascii="Times New Roman" w:hAnsi="Times New Roman"/>
+                <w:sz w:val="20"/>
+              </w:rPr>
+              <w:t>94,1</w:t>
+            </w:r>
+          </w:p>
+        </w:tc>
+      </w:tr>
+      <w:tr>
+        <w:tc>
+          <w:tcPr>
+            <w:tcW w:type="dxa" w:w="2280"/>
+          </w:tcPr>
+          <w:p>
+            <w:r>
+              <w:rPr>
+                <w:rFonts w:ascii="Times New Roman" w:hAnsi="Times New Roman"/>
+                <w:sz w:val="20"/>
+              </w:rPr>
+              <w:t>XP273-SKTI</w:t>
+            </w:r>
+          </w:p>
+        </w:tc>
+        <w:tc>
+          <w:tcPr>
+            <w:tcW w:type="dxa" w:w="2280"/>
+          </w:tcPr>
+          <w:p>
+            <w:r>
+              <w:rPr>
+                <w:rFonts w:ascii="Times New Roman" w:hAnsi="Times New Roman"/>
+                <w:sz w:val="20"/>
+              </w:rPr>
+              <w:t>ARG344-HID86</w:t>
+            </w:r>
+          </w:p>
+        </w:tc>
+        <w:tc>
+          <w:tcPr>
+            <w:tcW w:type="dxa" w:w="2280"/>
+          </w:tcPr>
+          <w:p>
+            <w:r>
+              <w:rPr>
+                <w:rFonts w:ascii="Times New Roman" w:hAnsi="Times New Roman"/>
+                <w:sz w:val="20"/>
+              </w:rPr>
+              <w:t>VdW</w:t>
+            </w:r>
+          </w:p>
+        </w:tc>
+        <w:tc>
+          <w:tcPr>
+            <w:tcW w:type="dxa" w:w="2280"/>
+          </w:tcPr>
+          <w:p>
+            <w:r>
+              <w:rPr>
+                <w:rFonts w:ascii="Times New Roman" w:hAnsi="Times New Roman"/>
+                <w:sz w:val="20"/>
+              </w:rPr>
+              <w:t>58,4</w:t>
+            </w:r>
+          </w:p>
+        </w:tc>
+      </w:tr>
+    </w:tbl>
+    <w:p>
+      <w:pPr/>
+    </w:p>
+    <w:p>
+      <w:pPr>
+        <w:pStyle w:val="Heading4"/>
+      </w:pPr>
+      <w:r>
+        <w:t>3.5.3 Integração mecanística e comparação com a literatura</w:t>
+      </w:r>
+    </w:p>
+    <w:p>
+      <w:pPr>
+        <w:jc w:val="both"/>
+      </w:pPr>
+      <w:r>
+        <w:t>A análise ProLIF refina e em um caso corrige os mecanismos de inibição estabelecidos pelas análises convencionais:</w:t>
+      </w:r>
+    </w:p>
+    <w:p>
+      <w:pPr>
+        <w:pStyle w:val="ListNumber"/>
+        <w:spacing w:after="60"/>
+      </w:pPr>
+      <w:r>
+        <w:rPr>
+          <w:b/>
+        </w:rPr>
+        <w:t>QCL936-GORE4</w:t>
+      </w:r>
+      <w:r>
+        <w:t>: A interação catiônica LYS303-ALA242 de 100% é o fundamento atômico da estabilidade superior do QCL936-GORE4. O bolsão S1 ácido (Asp241) atrai o terminal C-terminal catiônico (LYS303), mecanismo análogo ao da benzamidina mas com eficácia incomparavelmente maior — 100% versus 0% de persistência sustentada para BEN. Inibidores peptídicos com Lys/Arg na posição P1' podem explorar sistematicamente este princípio nas isoformas com Asp no S1.</w:t>
+      </w:r>
+    </w:p>
+    <w:p>
+      <w:pPr>
+        <w:pStyle w:val="ListNumber"/>
+        <w:spacing w:after="60"/>
+      </w:pPr>
+      <w:r>
+        <w:rPr>
+          <w:b/>
+        </w:rPr>
+        <w:t>ACR157-GORE4 vs QCL936-GORE4</w:t>
+      </w:r>
+      <w:r>
+        <w:t>: A diferença fundamental é a âncora: GLY228 backbone (fraca, ~50% VdW+HBDonor) versus ALA242 eletrostática (100% Catiônica). A ausência de Asp no S1 do ACR157 (Ile205 neutro) elimina a âncora iônica, forçando o GORE4 a ancorar-se em interações de backbone menos específicas.</w:t>
+      </w:r>
+    </w:p>
+    <w:p>
+      <w:pPr>
+        <w:pStyle w:val="ListNumber"/>
+        <w:spacing w:after="60"/>
+      </w:pPr>
+      <w:r>
+        <w:rPr>
+          <w:b/>
+        </w:rPr>
+        <w:t>XP273-SKTI — revisão do modo</w:t>
+      </w:r>
+      <w:r>
+        <w:t>: A detecção de ARG344-HID86 a 58% indica que o SKTI engaja a His86 catalítica no XP273, não previsto pela análise de distâncias monitorando Tyr83. O modo de inibição XP273-SKTI deve ser reclassificado para incluir contato com His catalítica (≥58% do tempo), aproximando-o de um modo Kunitz com engajamento His+Asp+S1 (parcial, 3/4 revisado).</w:t>
+      </w:r>
+    </w:p>
+    <w:p>
+      <w:pPr>
+        <w:pStyle w:val="ListNumber"/>
+        <w:spacing w:after="60"/>
+      </w:pPr>
+      <w:r>
+        <w:rPr>
+          <w:b/>
+        </w:rPr>
+        <w:t>Hierarquia ProLIF confirma hierarquia estrutural</w:t>
+      </w:r>
+      <w:r>
+        <w:t>: As persistências máximas de interação por sistema seguem a hierarquia ACR157-SKTI (100%) ≥ QCL936-SKTI (100%) &gt; XP273-SKTI (94%) para o SKTI, e QCL936-GORE4 (100%) &gt; ACR157-GORE4 (55%) &gt; XP273-GORE4 (28%) para o GORE4 — consistente com a hierarquia estabelecida por contatos, H-bonds e escores de docking HADDOCK.</w:t>
+      </w:r>
+    </w:p>
+    <w:p>
+      <w:pPr>
+        <w:pStyle w:val="ListNumber"/>
+        <w:spacing w:after="60"/>
+      </w:pPr>
+      <w:r>
+        <w:rPr>
+          <w:b/>
+        </w:rPr>
+        <w:t>Comparação com literatura</w:t>
+      </w:r>
+      <w:r>
+        <w:t xml:space="preserve">: A persistência de 100% para P1=Arg↔S1 no ACR157-SKTI está em plena consonância com simulações de complexos Kunitz canônicos (Krowarsch </w:t>
+      </w:r>
+      <w:r>
+        <w:rPr>
+          <w:i/>
+        </w:rPr>
+        <w:t>et al.</w:t>
+      </w:r>
+      <w:r>
+        <w:t>, 2003; Laskowski &amp; Kato, 1980), nas quais o P1=Lys/Arg permanece em contato íntimo ininterrupto com o resíduo do S1 durante toda a trajetória. A detecção de interações catiônicas dominating o fingerprint é esperada para interfaces enriquecidas em Arg/Lys — conforme Bouysset &amp; Fiorucci (2021) observaram que interações catiônicas e cátion-π são os tipos de maior persistência em complexos protease–inibidor.</w:t>
+      </w:r>
+    </w:p>
+    <w:p>
+      <w:pPr/>
+    </w:p>
+    <w:p>
+      <w:pPr>
+        <w:pStyle w:val="Heading2"/>
+      </w:pPr>
+      <w:r>
+        <w:t>Referências (a inserir)</w:t>
+      </w:r>
+    </w:p>
+    <w:p>
+      <w:pPr>
+        <w:pStyle w:val="ListBullet"/>
+        <w:spacing w:after="60"/>
+      </w:pPr>
+      <w:r>
+        <w:t xml:space="preserve">Abraham, M.J. </w:t>
+      </w:r>
+      <w:r>
+        <w:rPr>
+          <w:i/>
+        </w:rPr>
+        <w:t>et al.</w:t>
+      </w:r>
+      <w:r>
         <w:t xml:space="preserve"> (2015) GROMACS: A high performance molecular dynamics package. </w:t>
       </w:r>
       <w:r>
@@ -5580,6 +8182,186 @@
       </w:r>
       <w:r>
         <w:t>, 18, 1463–1472.</w:t>
+      </w:r>
+    </w:p>
+    <w:p>
+      <w:pPr>
+        <w:pStyle w:val="ListBullet"/>
+        <w:spacing w:after="60"/>
+      </w:pPr>
+      <w:r>
+        <w:t xml:space="preserve">Bouysset, C. &amp; Fiorucci, S. (2021) ProLIF: a library to encode protein–ligand interactions as fingerprints. </w:t>
+      </w:r>
+      <w:r>
+        <w:rPr>
+          <w:i/>
+        </w:rPr>
+        <w:t>J. Cheminform.</w:t>
+      </w:r>
+      <w:r>
+        <w:t>, 13, 72.</w:t>
+      </w:r>
+    </w:p>
+    <w:p>
+      <w:pPr>
+        <w:pStyle w:val="ListBullet"/>
+        <w:spacing w:after="60"/>
+      </w:pPr>
+      <w:r>
+        <w:t xml:space="preserve">Krowarsch, D. </w:t>
+      </w:r>
+      <w:r>
+        <w:rPr>
+          <w:i/>
+        </w:rPr>
+        <w:t>et al.</w:t>
+      </w:r>
+      <w:r>
+        <w:t xml:space="preserve"> (2003) Canonical protein inhibitors of serine proteases. </w:t>
+      </w:r>
+      <w:r>
+        <w:rPr>
+          <w:i/>
+        </w:rPr>
+        <w:t>Cell. Mol. Life Sci.</w:t>
+      </w:r>
+      <w:r>
+        <w:t>, 60, 2427–2444.</w:t>
+      </w:r>
+    </w:p>
+    <w:p>
+      <w:pPr>
+        <w:pStyle w:val="ListBullet"/>
+        <w:spacing w:after="60"/>
+      </w:pPr>
+      <w:r>
+        <w:t xml:space="preserve">Laskowski, M. Jr &amp; Kato, I. (1980) Protein inhibitors of proteinases. </w:t>
+      </w:r>
+      <w:r>
+        <w:rPr>
+          <w:i/>
+        </w:rPr>
+        <w:t>Annu. Rev. Biochem.</w:t>
+      </w:r>
+      <w:r>
+        <w:t>, 49, 593–626.</w:t>
+      </w:r>
+    </w:p>
+    <w:p>
+      <w:pPr>
+        <w:pStyle w:val="ListBullet"/>
+        <w:spacing w:after="60"/>
+      </w:pPr>
+      <w:r>
+        <w:t xml:space="preserve">Michaud-Agrawal, N. </w:t>
+      </w:r>
+      <w:r>
+        <w:rPr>
+          <w:i/>
+        </w:rPr>
+        <w:t>et al.</w:t>
+      </w:r>
+      <w:r>
+        <w:t xml:space="preserve"> (2011) MDAnalysis: A toolkit for the analysis of molecular dynamics simulations. </w:t>
+      </w:r>
+      <w:r>
+        <w:rPr>
+          <w:i/>
+        </w:rPr>
+        <w:t>J. Comput. Chem.</w:t>
+      </w:r>
+      <w:r>
+        <w:t>, 32, 2319–2327.</w:t>
+      </w:r>
+    </w:p>
+    <w:p>
+      <w:pPr>
+        <w:pStyle w:val="ListBullet"/>
+        <w:spacing w:after="60"/>
+      </w:pPr>
+      <w:r>
+        <w:t xml:space="preserve">Perona, J.J. &amp; Craik, C.S. (1995) Structural basis of substrate specificity in the serine proteases. </w:t>
+      </w:r>
+      <w:r>
+        <w:rPr>
+          <w:i/>
+        </w:rPr>
+        <w:t>Protein Sci.</w:t>
+      </w:r>
+      <w:r>
+        <w:t>, 4, 337–360.</w:t>
+      </w:r>
+    </w:p>
+    <w:p>
+      <w:pPr>
+        <w:pStyle w:val="ListBullet"/>
+        <w:spacing w:after="60"/>
+      </w:pPr>
+      <w:r>
+        <w:t xml:space="preserve">Scheidig, A.J. </w:t>
+      </w:r>
+      <w:r>
+        <w:rPr>
+          <w:i/>
+        </w:rPr>
+        <w:t>et al.</w:t>
+      </w:r>
+      <w:r>
+        <w:t xml:space="preserve"> (1997) Crystal structures of bovine pancreatic trypsin at 1.68 Å resolution. </w:t>
+      </w:r>
+      <w:r>
+        <w:rPr>
+          <w:i/>
+        </w:rPr>
+        <w:t>J. Mol. Biol.</w:t>
+      </w:r>
+      <w:r>
+        <w:t>, 275, 469–483.</w:t>
+      </w:r>
+    </w:p>
+    <w:p>
+      <w:pPr>
+        <w:pStyle w:val="ListBullet"/>
+        <w:spacing w:after="60"/>
+      </w:pPr>
+      <w:r>
+        <w:t xml:space="preserve">Sousa da Silva, A.W. &amp; Vranken, W.F. (2012) ACPYPE – AnteChamber PYthon Parser interfacE. </w:t>
+      </w:r>
+      <w:r>
+        <w:rPr>
+          <w:i/>
+        </w:rPr>
+        <w:t>BMC Res. Notes</w:t>
+      </w:r>
+      <w:r>
+        <w:t>, 5, 367.</w:t>
+      </w:r>
+    </w:p>
+    <w:p>
+      <w:pPr>
+        <w:pStyle w:val="ListBullet"/>
+        <w:spacing w:after="60"/>
+      </w:pPr>
+      <w:r>
+        <w:t xml:space="preserve">Wang, J. </w:t>
+      </w:r>
+      <w:r>
+        <w:rPr>
+          <w:i/>
+        </w:rPr>
+        <w:t>et al.</w:t>
+      </w:r>
+      <w:r>
+        <w:t xml:space="preserve"> (2004) Development and testing of a general amber force field. </w:t>
+      </w:r>
+      <w:r>
+        <w:rPr>
+          <w:i/>
+        </w:rPr>
+        <w:t>J. Comput. Chem.</w:t>
+      </w:r>
+      <w:r>
+        <w:t>, 25, 1157–1174.</w:t>
       </w:r>
     </w:p>
     <w:p>

</xml_diff>